<commit_message>
kubernetes - deployment updated
</commit_message>
<xml_diff>
--- a/Kubernetes/6-deployment.docx
+++ b/Kubernetes/6-deployment.docx
@@ -1,6 +1,6 @@
 
 <file path=word/document.xml><?xml version="1.0" encoding="utf-8"?>
-<w:document xmlns:wpc="http://schemas.microsoft.com/office/word/2010/wordprocessingCanvas" xmlns:cx="http://schemas.microsoft.com/office/drawing/2014/chartex" xmlns:cx1="http://schemas.microsoft.com/office/drawing/2015/9/8/chartex" xmlns:cx2="http://schemas.microsoft.com/office/drawing/2015/10/21/chartex" xmlns:cx3="http://schemas.microsoft.com/office/drawing/2016/5/9/chartex" xmlns:cx4="http://schemas.microsoft.com/office/drawing/2016/5/10/chartex" xmlns:cx5="http://schemas.microsoft.com/office/drawing/2016/5/11/chartex" xmlns:cx6="http://schemas.microsoft.com/office/drawing/2016/5/12/chartex" xmlns:cx7="http://schemas.microsoft.com/office/drawing/2016/5/13/chartex" xmlns:cx8="http://schemas.microsoft.com/office/drawing/2016/5/14/chartex" xmlns:mc="http://schemas.openxmlformats.org/markup-compatibility/2006" xmlns:aink="http://schemas.microsoft.com/office/drawing/2016/ink" xmlns:am3d="http://schemas.microsoft.com/office/drawing/2017/model3d" xmlns:o="urn:schemas-microsoft-com:office:office" xmlns:oel="http://schemas.microsoft.com/office/2019/extlst" xmlns:r="http://schemas.openxmlformats.org/officeDocument/2006/relationships" xmlns:m="http://schemas.openxmlformats.org/officeDocument/2006/math" xmlns:v="urn:schemas-microsoft-com:vml" xmlns:wp14="http://schemas.microsoft.com/office/word/2010/wordprocessingDrawing" xmlns:wp="http://schemas.openxmlformats.org/drawingml/2006/wordprocessingDrawing" xmlns:w10="urn:schemas-microsoft-com:office:word" xmlns:w="http://schemas.openxmlformats.org/wordprocessingml/2006/main" xmlns:w14="http://schemas.microsoft.com/office/word/2010/wordml" xmlns:w15="http://schemas.microsoft.com/office/word/2012/wordml" xmlns:w16cex="http://schemas.microsoft.com/office/word/2018/wordml/cex" xmlns:w16cid="http://schemas.microsoft.com/office/word/2016/wordml/cid" xmlns:w16="http://schemas.microsoft.com/office/word/2018/wordml" xmlns:w16sdtdh="http://schemas.microsoft.com/office/word/2020/wordml/sdtdatahash" xmlns:w16se="http://schemas.microsoft.com/office/word/2015/wordml/symex" xmlns:wpg="http://schemas.microsoft.com/office/word/2010/wordprocessingGroup" xmlns:wpi="http://schemas.microsoft.com/office/word/2010/wordprocessingInk" xmlns:wne="http://schemas.microsoft.com/office/word/2006/wordml" xmlns:wps="http://schemas.microsoft.com/office/word/2010/wordprocessingShape" mc:Ignorable="w14 w15 w16se w16cid w16 w16cex w16sdtdh wp14">
+<w:document xmlns:wpc="http://schemas.microsoft.com/office/word/2010/wordprocessingCanvas" xmlns:cx="http://schemas.microsoft.com/office/drawing/2014/chartex" xmlns:cx1="http://schemas.microsoft.com/office/drawing/2015/9/8/chartex" xmlns:cx2="http://schemas.microsoft.com/office/drawing/2015/10/21/chartex" xmlns:cx3="http://schemas.microsoft.com/office/drawing/2016/5/9/chartex" xmlns:cx4="http://schemas.microsoft.com/office/drawing/2016/5/10/chartex" xmlns:cx5="http://schemas.microsoft.com/office/drawing/2016/5/11/chartex" xmlns:cx6="http://schemas.microsoft.com/office/drawing/2016/5/12/chartex" xmlns:cx7="http://schemas.microsoft.com/office/drawing/2016/5/13/chartex" xmlns:cx8="http://schemas.microsoft.com/office/drawing/2016/5/14/chartex" xmlns:mc="http://schemas.openxmlformats.org/markup-compatibility/2006" xmlns:aink="http://schemas.microsoft.com/office/drawing/2016/ink" xmlns:am3d="http://schemas.microsoft.com/office/drawing/2017/model3d" xmlns:o="urn:schemas-microsoft-com:office:office" xmlns:oel="http://schemas.microsoft.com/office/2019/extlst" xmlns:r="http://schemas.openxmlformats.org/officeDocument/2006/relationships" xmlns:m="http://schemas.openxmlformats.org/officeDocument/2006/math" xmlns:v="urn:schemas-microsoft-com:vml" xmlns:wp14="http://schemas.microsoft.com/office/word/2010/wordprocessingDrawing" xmlns:wp="http://schemas.openxmlformats.org/drawingml/2006/wordprocessingDrawing" xmlns:w10="urn:schemas-microsoft-com:office:word" xmlns:w="http://schemas.openxmlformats.org/wordprocessingml/2006/main" xmlns:w14="http://schemas.microsoft.com/office/word/2010/wordml" xmlns:w15="http://schemas.microsoft.com/office/word/2012/wordml" xmlns:w16cex="http://schemas.microsoft.com/office/word/2018/wordml/cex" xmlns:w16cid="http://schemas.microsoft.com/office/word/2016/wordml/cid" xmlns:w16="http://schemas.microsoft.com/office/word/2018/wordml" xmlns:w16du="http://schemas.microsoft.com/office/word/2023/wordml/word16du" xmlns:w16sdtdh="http://schemas.microsoft.com/office/word/2020/wordml/sdtdatahash" xmlns:w16sdtfl="http://schemas.microsoft.com/office/word/2024/wordml/sdtformatlock" xmlns:w16se="http://schemas.microsoft.com/office/word/2015/wordml/symex" xmlns:wpg="http://schemas.microsoft.com/office/word/2010/wordprocessingGroup" xmlns:wpi="http://schemas.microsoft.com/office/word/2010/wordprocessingInk" xmlns:wne="http://schemas.microsoft.com/office/word/2006/wordml" xmlns:wps="http://schemas.microsoft.com/office/word/2010/wordprocessingShape" mc:Ignorable="w14 w15 w16se w16cid w16 w16cex w16sdtdh w16sdtfl w16du wp14">
   <w:body>
     <w:p>
       <w:pPr>
@@ -244,7 +244,43 @@
                                 <w:sz w:val="28"/>
                                 <w:szCs w:val="28"/>
                               </w:rPr>
-                              <w:t>as stateless or stateful depending on whether they store or depend on persistent data between</w:t>
+                              <w:t xml:space="preserve">as </w:t>
+                            </w:r>
+                            <w:r>
+                              <w:rPr>
+                                <w:rFonts w:asciiTheme="majorBidi" w:hAnsiTheme="majorBidi" w:cstheme="majorBidi"/>
+                                <w:b/>
+                                <w:bCs/>
+                                <w:sz w:val="28"/>
+                                <w:szCs w:val="28"/>
+                              </w:rPr>
+                              <w:t>stateless</w:t>
+                            </w:r>
+                            <w:r>
+                              <w:rPr>
+                                <w:rFonts w:asciiTheme="majorBidi" w:hAnsiTheme="majorBidi" w:cstheme="majorBidi"/>
+                                <w:sz w:val="28"/>
+                                <w:szCs w:val="28"/>
+                              </w:rPr>
+                              <w:t xml:space="preserve"> or </w:t>
+                            </w:r>
+                            <w:r>
+                              <w:rPr>
+                                <w:rFonts w:asciiTheme="majorBidi" w:hAnsiTheme="majorBidi" w:cstheme="majorBidi"/>
+                                <w:b/>
+                                <w:bCs/>
+                                <w:sz w:val="28"/>
+                                <w:szCs w:val="28"/>
+                              </w:rPr>
+                              <w:t>stateful</w:t>
+                            </w:r>
+                            <w:r>
+                              <w:rPr>
+                                <w:rFonts w:asciiTheme="majorBidi" w:hAnsiTheme="majorBidi" w:cstheme="majorBidi"/>
+                                <w:sz w:val="28"/>
+                                <w:szCs w:val="28"/>
+                              </w:rPr>
+                              <w:t xml:space="preserve"> depending on whether they store or depend on persistent data between</w:t>
                             </w:r>
                             <w:r>
                               <w:rPr>
@@ -739,7 +775,43 @@
                           <w:sz w:val="28"/>
                           <w:szCs w:val="28"/>
                         </w:rPr>
-                        <w:t>as stateless or stateful depending on whether they store or depend on persistent data between</w:t>
+                        <w:t xml:space="preserve">as </w:t>
+                      </w:r>
+                      <w:r>
+                        <w:rPr>
+                          <w:rFonts w:asciiTheme="majorBidi" w:hAnsiTheme="majorBidi" w:cstheme="majorBidi"/>
+                          <w:b/>
+                          <w:bCs/>
+                          <w:sz w:val="28"/>
+                          <w:szCs w:val="28"/>
+                        </w:rPr>
+                        <w:t>stateless</w:t>
+                      </w:r>
+                      <w:r>
+                        <w:rPr>
+                          <w:rFonts w:asciiTheme="majorBidi" w:hAnsiTheme="majorBidi" w:cstheme="majorBidi"/>
+                          <w:sz w:val="28"/>
+                          <w:szCs w:val="28"/>
+                        </w:rPr>
+                        <w:t xml:space="preserve"> or </w:t>
+                      </w:r>
+                      <w:r>
+                        <w:rPr>
+                          <w:rFonts w:asciiTheme="majorBidi" w:hAnsiTheme="majorBidi" w:cstheme="majorBidi"/>
+                          <w:b/>
+                          <w:bCs/>
+                          <w:sz w:val="28"/>
+                          <w:szCs w:val="28"/>
+                        </w:rPr>
+                        <w:t>stateful</w:t>
+                      </w:r>
+                      <w:r>
+                        <w:rPr>
+                          <w:rFonts w:asciiTheme="majorBidi" w:hAnsiTheme="majorBidi" w:cstheme="majorBidi"/>
+                          <w:sz w:val="28"/>
+                          <w:szCs w:val="28"/>
+                        </w:rPr>
+                        <w:t xml:space="preserve"> depending on whether they store or depend on persistent data between</w:t>
                       </w:r>
                       <w:r>
                         <w:rPr>
@@ -5581,7 +5653,7 @@
         <mc:AlternateContent>
           <mc:Choice Requires="wps">
             <w:drawing>
-              <wp:anchor distT="0" distB="0" distL="114300" distR="114300" simplePos="0" relativeHeight="251663360" behindDoc="0" locked="0" layoutInCell="1" allowOverlap="1" wp14:anchorId="709DF79A" wp14:editId="7730CF5F">
+              <wp:anchor distT="0" distB="0" distL="114300" distR="114300" simplePos="0" relativeHeight="251663360" behindDoc="0" locked="0" layoutInCell="1" allowOverlap="1" wp14:anchorId="709DF79A" wp14:editId="2C2CC901">
                 <wp:simplePos x="0" y="0"/>
                 <wp:positionH relativeFrom="margin">
                   <wp:align>left</wp:align>
@@ -5589,8 +5661,8 @@
                 <wp:positionV relativeFrom="paragraph">
                   <wp:posOffset>408708</wp:posOffset>
                 </wp:positionV>
-                <wp:extent cx="4892040" cy="6241473"/>
-                <wp:effectExtent l="0" t="0" r="22860" b="26035"/>
+                <wp:extent cx="2674620" cy="6241473"/>
+                <wp:effectExtent l="0" t="0" r="11430" b="26035"/>
                 <wp:wrapNone/>
                 <wp:docPr id="1971709200" name="Rectangle 6"/>
                 <wp:cNvGraphicFramePr/>
@@ -5601,7 +5673,7 @@
                       <wps:spPr>
                         <a:xfrm>
                           <a:off x="0" y="0"/>
-                          <a:ext cx="4892040" cy="6241473"/>
+                          <a:ext cx="2674620" cy="6241473"/>
                         </a:xfrm>
                         <a:prstGeom prst="rect">
                           <a:avLst/>
@@ -6739,7 +6811,7 @@
           </mc:Choice>
           <mc:Fallback>
             <w:pict>
-              <v:rect w14:anchorId="709DF79A" id="Rectangle 6" o:spid="_x0000_s1030" style="position:absolute;left:0;text-align:left;margin-left:0;margin-top:32.2pt;width:385.2pt;height:491.45pt;z-index:251663360;visibility:visible;mso-wrap-style:square;mso-width-percent:0;mso-height-percent:0;mso-wrap-distance-left:9pt;mso-wrap-distance-top:0;mso-wrap-distance-right:9pt;mso-wrap-distance-bottom:0;mso-position-horizontal:left;mso-position-horizontal-relative:margin;mso-position-vertical:absolute;mso-position-vertical-relative:text;mso-width-percent:0;mso-height-percent:0;mso-width-relative:margin;mso-height-relative:margin;v-text-anchor:middle" o:gfxdata="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" fillcolor="black [3200]" strokecolor="black [480]" strokeweight="1pt">
+              <v:rect w14:anchorId="709DF79A" id="Rectangle 6" o:spid="_x0000_s1030" style="position:absolute;left:0;text-align:left;margin-left:0;margin-top:32.2pt;width:210.6pt;height:491.45pt;z-index:251663360;visibility:visible;mso-wrap-style:square;mso-width-percent:0;mso-height-percent:0;mso-wrap-distance-left:9pt;mso-wrap-distance-top:0;mso-wrap-distance-right:9pt;mso-wrap-distance-bottom:0;mso-position-horizontal:left;mso-position-horizontal-relative:margin;mso-position-vertical:absolute;mso-position-vertical-relative:text;mso-width-percent:0;mso-height-percent:0;mso-width-relative:margin;mso-height-relative:margin;v-text-anchor:middle" o:gfxdata="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" fillcolor="black [3200]" strokecolor="black [480]" strokeweight="1pt">
                 <v:textbox>
                   <w:txbxContent>
                     <w:p>
@@ -8035,6 +8107,7 @@
     </w:p>
     <w:p>
       <w:pPr>
+        <w:spacing w:after="120"/>
         <w:jc w:val="both"/>
         <w:rPr>
           <w:rFonts w:asciiTheme="majorBidi" w:hAnsiTheme="majorBidi" w:cstheme="majorBidi"/>
@@ -8107,6 +8180,7 @@
     </w:p>
     <w:p>
       <w:pPr>
+        <w:spacing w:after="60"/>
         <w:jc w:val="both"/>
         <w:rPr>
           <w:rFonts w:asciiTheme="majorBidi" w:hAnsiTheme="majorBidi" w:cstheme="majorBidi"/>
@@ -8129,6 +8203,7 @@
     </w:p>
     <w:p>
       <w:pPr>
+        <w:spacing w:after="60"/>
         <w:jc w:val="both"/>
         <w:rPr>
           <w:rFonts w:asciiTheme="majorBidi" w:hAnsiTheme="majorBidi" w:cstheme="majorBidi"/>
@@ -8163,6 +8238,7 @@
     </w:p>
     <w:p>
       <w:pPr>
+        <w:spacing w:after="120"/>
         <w:jc w:val="both"/>
         <w:rPr>
           <w:rFonts w:asciiTheme="majorBidi" w:hAnsiTheme="majorBidi" w:cstheme="majorBidi"/>
@@ -8215,6 +8291,7 @@
     </w:p>
     <w:p>
       <w:pPr>
+        <w:spacing w:after="60"/>
         <w:jc w:val="both"/>
         <w:rPr>
           <w:rFonts w:asciiTheme="majorBidi" w:hAnsiTheme="majorBidi" w:cstheme="majorBidi"/>
@@ -8256,7 +8333,6 @@
           <w:sz w:val="28"/>
           <w:szCs w:val="28"/>
         </w:rPr>
-        <w:lastRenderedPageBreak/>
         <w:t>nginx-deployment-7c9d8f6d5b-abc12</w:t>
       </w:r>
     </w:p>
@@ -8280,6 +8356,7 @@
           <w:sz w:val="28"/>
           <w:szCs w:val="28"/>
         </w:rPr>
+        <w:lastRenderedPageBreak/>
         <w:t>ReplicaSet</w:t>
       </w:r>
       <w:proofErr w:type="spellEnd"/>
@@ -8591,7 +8668,11 @@
           <w:szCs w:val="40"/>
         </w:rPr>
       </w:pPr>
-      <w:r>
+    </w:p>
+    <w:p>
+      <w:pPr>
+        <w:spacing w:after="120"/>
+        <w:jc w:val="both"/>
         <w:rPr>
           <w:rFonts w:asciiTheme="majorBidi" w:hAnsiTheme="majorBidi" w:cstheme="majorBidi"/>
           <w:b/>
@@ -8599,12 +8680,22 @@
           <w:sz w:val="40"/>
           <w:szCs w:val="40"/>
         </w:rPr>
+      </w:pPr>
+      <w:r>
+        <w:rPr>
+          <w:rFonts w:asciiTheme="majorBidi" w:hAnsiTheme="majorBidi" w:cstheme="majorBidi"/>
+          <w:b/>
+          <w:bCs/>
+          <w:sz w:val="40"/>
+          <w:szCs w:val="40"/>
+        </w:rPr>
         <w:lastRenderedPageBreak/>
         <w:t>Update Strategy:</w:t>
       </w:r>
     </w:p>
     <w:p>
       <w:pPr>
+        <w:spacing w:after="120"/>
         <w:jc w:val="both"/>
         <w:rPr>
           <w:rFonts w:asciiTheme="majorBidi" w:hAnsiTheme="majorBidi" w:cstheme="majorBidi"/>
@@ -8623,6 +8714,7 @@
     </w:p>
     <w:p>
       <w:pPr>
+        <w:spacing w:after="60"/>
         <w:jc w:val="both"/>
         <w:rPr>
           <w:rFonts w:asciiTheme="majorBidi" w:hAnsiTheme="majorBidi" w:cstheme="majorBidi"/>
@@ -8683,6 +8775,10 @@
       <w:r>
         <w:rPr>
           <w:rFonts w:asciiTheme="majorBidi" w:hAnsiTheme="majorBidi" w:cstheme="majorBidi"/>
+          <w:b/>
+          <w:bCs/>
+          <w:i/>
+          <w:iCs/>
           <w:sz w:val="28"/>
           <w:szCs w:val="28"/>
         </w:rPr>
@@ -9978,6 +10074,7 @@
     </w:p>
     <w:p>
       <w:pPr>
+        <w:spacing w:after="80"/>
         <w:ind w:left="360"/>
         <w:jc w:val="both"/>
         <w:rPr>
@@ -9998,6 +10095,10 @@
       <w:r>
         <w:rPr>
           <w:rFonts w:asciiTheme="majorBidi" w:hAnsiTheme="majorBidi" w:cstheme="majorBidi"/>
+          <w:b/>
+          <w:bCs/>
+          <w:i/>
+          <w:iCs/>
           <w:sz w:val="28"/>
           <w:szCs w:val="28"/>
         </w:rPr>
@@ -10113,6 +10214,7 @@
           <w:ilvl w:val="0"/>
           <w:numId w:val="19"/>
         </w:numPr>
+        <w:spacing w:after="80"/>
         <w:ind w:left="720"/>
         <w:jc w:val="both"/>
         <w:rPr>
@@ -10152,16 +10254,16 @@
         <mc:AlternateContent>
           <mc:Choice Requires="wps">
             <w:drawing>
-              <wp:anchor distT="0" distB="0" distL="114300" distR="114300" simplePos="0" relativeHeight="251665408" behindDoc="0" locked="0" layoutInCell="1" allowOverlap="1" wp14:anchorId="36BD9B9B" wp14:editId="23074720">
+              <wp:anchor distT="0" distB="0" distL="114300" distR="114300" simplePos="0" relativeHeight="251665408" behindDoc="0" locked="0" layoutInCell="1" allowOverlap="1" wp14:anchorId="36BD9B9B" wp14:editId="0A21B3DA">
                 <wp:simplePos x="0" y="0"/>
                 <wp:positionH relativeFrom="column">
-                  <wp:posOffset>235527</wp:posOffset>
+                  <wp:posOffset>236220</wp:posOffset>
                 </wp:positionH>
                 <wp:positionV relativeFrom="paragraph">
-                  <wp:posOffset>289098</wp:posOffset>
+                  <wp:posOffset>265430</wp:posOffset>
                 </wp:positionV>
-                <wp:extent cx="2327564" cy="651164"/>
-                <wp:effectExtent l="0" t="0" r="15875" b="15875"/>
+                <wp:extent cx="2327564" cy="594360"/>
+                <wp:effectExtent l="0" t="0" r="15875" b="15240"/>
                 <wp:wrapNone/>
                 <wp:docPr id="122299299" name="Rectangle 11"/>
                 <wp:cNvGraphicFramePr/>
@@ -10172,7 +10274,7 @@
                       <wps:spPr>
                         <a:xfrm>
                           <a:off x="0" y="0"/>
-                          <a:ext cx="2327564" cy="651164"/>
+                          <a:ext cx="2327564" cy="594360"/>
                         </a:xfrm>
                         <a:prstGeom prst="rect">
                           <a:avLst/>
@@ -10274,7 +10376,7 @@
           </mc:Choice>
           <mc:Fallback>
             <w:pict>
-              <v:rect w14:anchorId="36BD9B9B" id="Rectangle 11" o:spid="_x0000_s1032" style="position:absolute;left:0;text-align:left;margin-left:18.55pt;margin-top:22.75pt;width:183.25pt;height:51.25pt;z-index:251665408;visibility:visible;mso-wrap-style:square;mso-width-percent:0;mso-height-percent:0;mso-wrap-distance-left:9pt;mso-wrap-distance-top:0;mso-wrap-distance-right:9pt;mso-wrap-distance-bottom:0;mso-position-horizontal:absolute;mso-position-horizontal-relative:text;mso-position-vertical:absolute;mso-position-vertical-relative:text;mso-width-percent:0;mso-height-percent:0;mso-width-relative:margin;mso-height-relative:margin;v-text-anchor:middle" o:gfxdata="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" fillcolor="black [3200]" strokecolor="black [480]" strokeweight="1pt">
+              <v:rect w14:anchorId="36BD9B9B" id="Rectangle 11" o:spid="_x0000_s1032" style="position:absolute;left:0;text-align:left;margin-left:18.6pt;margin-top:20.9pt;width:183.25pt;height:46.8pt;z-index:251665408;visibility:visible;mso-wrap-style:square;mso-width-percent:0;mso-height-percent:0;mso-wrap-distance-left:9pt;mso-wrap-distance-top:0;mso-wrap-distance-right:9pt;mso-wrap-distance-bottom:0;mso-position-horizontal:absolute;mso-position-horizontal-relative:text;mso-position-vertical:absolute;mso-position-vertical-relative:text;mso-width-percent:0;mso-height-percent:0;mso-width-relative:margin;mso-height-relative:margin;v-text-anchor:middle" o:gfxdata="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" fillcolor="black [3200]" strokecolor="black [480]" strokeweight="1pt">
                 <v:textbox>
                   <w:txbxContent>
                     <w:p>
@@ -10367,13 +10469,14 @@
         <w:jc w:val="both"/>
         <w:rPr>
           <w:rFonts w:asciiTheme="majorBidi" w:hAnsiTheme="majorBidi" w:cstheme="majorBidi"/>
-          <w:sz w:val="28"/>
-          <w:szCs w:val="28"/>
-        </w:rPr>
-      </w:pPr>
-    </w:p>
-    <w:p>
-      <w:pPr>
+          <w:sz w:val="16"/>
+          <w:szCs w:val="16"/>
+        </w:rPr>
+      </w:pPr>
+    </w:p>
+    <w:p>
+      <w:pPr>
+        <w:spacing w:after="60"/>
         <w:ind w:left="360"/>
         <w:jc w:val="both"/>
         <w:rPr>
@@ -10460,6 +10563,7 @@
           <w:ilvl w:val="0"/>
           <w:numId w:val="20"/>
         </w:numPr>
+        <w:spacing w:after="120"/>
         <w:ind w:left="720"/>
         <w:jc w:val="both"/>
         <w:rPr>
@@ -10479,6 +10583,7 @@
     </w:p>
     <w:p>
       <w:pPr>
+        <w:spacing w:after="60"/>
         <w:ind w:left="360"/>
         <w:jc w:val="both"/>
         <w:rPr>
@@ -10529,6 +10634,7 @@
           <w:ilvl w:val="0"/>
           <w:numId w:val="21"/>
         </w:numPr>
+        <w:spacing w:after="120"/>
         <w:ind w:left="720"/>
         <w:jc w:val="both"/>
         <w:rPr>
@@ -10548,30 +10654,30 @@
     </w:p>
     <w:p>
       <w:pPr>
-        <w:jc w:val="both"/>
-        <w:rPr>
-          <w:rFonts w:asciiTheme="majorBidi" w:hAnsiTheme="majorBidi" w:cstheme="majorBidi"/>
-          <w:b/>
-          <w:bCs/>
-          <w:sz w:val="28"/>
-          <w:szCs w:val="28"/>
-          <w:u w:val="single"/>
-        </w:rPr>
-      </w:pPr>
-      <w:r>
-        <w:rPr>
-          <w:rFonts w:asciiTheme="majorBidi" w:hAnsiTheme="majorBidi" w:cstheme="majorBidi"/>
-          <w:b/>
-          <w:bCs/>
-          <w:sz w:val="28"/>
-          <w:szCs w:val="28"/>
-          <w:u w:val="single"/>
+        <w:spacing w:after="60"/>
+        <w:jc w:val="both"/>
+        <w:rPr>
+          <w:rFonts w:asciiTheme="majorBidi" w:hAnsiTheme="majorBidi" w:cstheme="majorBidi"/>
+          <w:b/>
+          <w:bCs/>
+          <w:sz w:val="32"/>
+          <w:szCs w:val="32"/>
+        </w:rPr>
+      </w:pPr>
+      <w:r>
+        <w:rPr>
+          <w:rFonts w:asciiTheme="majorBidi" w:hAnsiTheme="majorBidi" w:cstheme="majorBidi"/>
+          <w:b/>
+          <w:bCs/>
+          <w:sz w:val="32"/>
+          <w:szCs w:val="32"/>
         </w:rPr>
         <w:t>Quick Comparison:</w:t>
       </w:r>
     </w:p>
     <w:p>
       <w:pPr>
+        <w:spacing w:after="60"/>
         <w:jc w:val="both"/>
         <w:rPr>
           <w:rFonts w:asciiTheme="majorBidi" w:hAnsiTheme="majorBidi" w:cstheme="majorBidi"/>
@@ -10683,6 +10789,7 @@
           <w:ilvl w:val="0"/>
           <w:numId w:val="22"/>
         </w:numPr>
+        <w:spacing w:after="80"/>
         <w:ind w:left="360"/>
         <w:jc w:val="both"/>
         <w:rPr>
@@ -10702,6 +10809,7 @@
     </w:p>
     <w:p>
       <w:pPr>
+        <w:spacing w:after="60"/>
         <w:jc w:val="both"/>
         <w:rPr>
           <w:rFonts w:asciiTheme="majorBidi" w:hAnsiTheme="majorBidi" w:cstheme="majorBidi"/>
@@ -10801,6 +10909,7 @@
           <w:ilvl w:val="0"/>
           <w:numId w:val="23"/>
         </w:numPr>
+        <w:spacing w:after="80"/>
         <w:ind w:left="360"/>
         <w:jc w:val="both"/>
         <w:rPr>
@@ -10820,29 +10929,30 @@
     </w:p>
     <w:p>
       <w:pPr>
-        <w:jc w:val="both"/>
-        <w:rPr>
-          <w:rFonts w:asciiTheme="majorBidi" w:hAnsiTheme="majorBidi" w:cstheme="majorBidi"/>
-          <w:b/>
-          <w:bCs/>
-          <w:sz w:val="28"/>
-          <w:szCs w:val="28"/>
-        </w:rPr>
-      </w:pPr>
-      <w:r>
-        <w:rPr>
-          <w:rFonts w:asciiTheme="majorBidi" w:hAnsiTheme="majorBidi" w:cstheme="majorBidi"/>
-          <w:b/>
-          <w:bCs/>
-          <w:sz w:val="28"/>
-          <w:szCs w:val="28"/>
-        </w:rPr>
-        <w:lastRenderedPageBreak/>
+        <w:spacing w:after="60"/>
+        <w:jc w:val="both"/>
+        <w:rPr>
+          <w:rFonts w:asciiTheme="majorBidi" w:hAnsiTheme="majorBidi" w:cstheme="majorBidi"/>
+          <w:b/>
+          <w:bCs/>
+          <w:sz w:val="28"/>
+          <w:szCs w:val="28"/>
+        </w:rPr>
+      </w:pPr>
+      <w:r>
+        <w:rPr>
+          <w:rFonts w:asciiTheme="majorBidi" w:hAnsiTheme="majorBidi" w:cstheme="majorBidi"/>
+          <w:b/>
+          <w:bCs/>
+          <w:sz w:val="28"/>
+          <w:szCs w:val="28"/>
+        </w:rPr>
         <w:t>Important Concept</w:t>
       </w:r>
     </w:p>
     <w:p>
       <w:pPr>
+        <w:spacing w:after="60"/>
         <w:jc w:val="both"/>
         <w:rPr>
           <w:rFonts w:asciiTheme="majorBidi" w:hAnsiTheme="majorBidi" w:cstheme="majorBidi"/>
@@ -10916,6 +11026,7 @@
           <w:sz w:val="28"/>
           <w:szCs w:val="28"/>
         </w:rPr>
+        <w:lastRenderedPageBreak/>
         <w:t>gradually shift traffic to new Pods</w:t>
       </w:r>
     </w:p>
@@ -10950,6 +11061,7 @@
           <w:ilvl w:val="0"/>
           <w:numId w:val="24"/>
         </w:numPr>
+        <w:spacing w:after="60"/>
         <w:ind w:left="360"/>
         <w:jc w:val="both"/>
         <w:rPr>
@@ -11004,7 +11116,7 @@
         <mc:AlternateContent>
           <mc:Choice Requires="wps">
             <w:drawing>
-              <wp:anchor distT="0" distB="0" distL="114300" distR="114300" simplePos="0" relativeHeight="251670528" behindDoc="0" locked="0" layoutInCell="1" allowOverlap="1" wp14:anchorId="69406AD8" wp14:editId="674FC09A">
+              <wp:anchor distT="0" distB="0" distL="114300" distR="114300" simplePos="0" relativeHeight="251670528" behindDoc="0" locked="0" layoutInCell="1" allowOverlap="1" wp14:anchorId="69406AD8" wp14:editId="28EC90E1">
                 <wp:simplePos x="0" y="0"/>
                 <wp:positionH relativeFrom="margin">
                   <wp:align>right</wp:align>
@@ -11012,8 +11124,8 @@
                 <wp:positionV relativeFrom="paragraph">
                   <wp:posOffset>355715</wp:posOffset>
                 </wp:positionV>
-                <wp:extent cx="6850380" cy="6988984"/>
-                <wp:effectExtent l="0" t="0" r="26670" b="21590"/>
+                <wp:extent cx="6850380" cy="6804660"/>
+                <wp:effectExtent l="0" t="0" r="26670" b="15240"/>
                 <wp:wrapNone/>
                 <wp:docPr id="1353480336" name="Rectangle 16"/>
                 <wp:cNvGraphicFramePr/>
@@ -11024,7 +11136,7 @@
                       <wps:spPr>
                         <a:xfrm>
                           <a:off x="0" y="0"/>
-                          <a:ext cx="6850380" cy="6988984"/>
+                          <a:ext cx="6850380" cy="6804660"/>
                         </a:xfrm>
                         <a:prstGeom prst="rect">
                           <a:avLst/>
@@ -11100,7 +11212,7 @@
                           </w:p>
                           <w:p>
                             <w:pPr>
-                              <w:spacing w:after="120"/>
+                              <w:spacing w:after="80"/>
                               <w:jc w:val="both"/>
                               <w:rPr>
                                 <w:rFonts w:asciiTheme="majorBidi" w:hAnsiTheme="majorBidi" w:cstheme="majorBidi"/>
@@ -11140,7 +11252,7 @@
                                 <w:ilvl w:val="0"/>
                                 <w:numId w:val="57"/>
                               </w:numPr>
-                              <w:spacing w:after="60"/>
+                              <w:spacing w:after="0"/>
                               <w:ind w:left="360"/>
                               <w:jc w:val="both"/>
                               <w:rPr>
@@ -11156,6 +11268,22 @@
                                 <w:szCs w:val="28"/>
                               </w:rPr>
                               <w:t>Rolling update can resemble canary, but it is not a full canary strategy.</w:t>
+                            </w:r>
+                            <w:r>
+                              <w:rPr>
+                                <w:rFonts w:asciiTheme="majorBidi" w:hAnsiTheme="majorBidi" w:cstheme="majorBidi"/>
+                                <w:sz w:val="28"/>
+                                <w:szCs w:val="28"/>
+                              </w:rPr>
+                              <w:t xml:space="preserve"> </w:t>
+                            </w:r>
+                            <w:r>
+                              <w:rPr>
+                                <w:rFonts w:asciiTheme="majorBidi" w:hAnsiTheme="majorBidi" w:cstheme="majorBidi"/>
+                                <w:sz w:val="28"/>
+                                <w:szCs w:val="28"/>
+                              </w:rPr>
+                              <w:t>A canary update intentionally releases the new version to a very small portion of traffic first, while the majority of users still use the old version. While a rolling update gradually replaces old Pods with new Pods until all Pods run the new version.</w:t>
                             </w:r>
                           </w:p>
                           <w:p>
@@ -11175,64 +11303,28 @@
                                 <w:sz w:val="28"/>
                                 <w:szCs w:val="28"/>
                               </w:rPr>
-                              <w:t>A canary update intentionally releases the new version to a very small portion of traffic first, while the majority of users still use the old version.</w:t>
-                            </w:r>
-                            <w:r>
-                              <w:rPr>
-                                <w:rFonts w:asciiTheme="majorBidi" w:hAnsiTheme="majorBidi" w:cstheme="majorBidi"/>
-                                <w:sz w:val="28"/>
-                                <w:szCs w:val="28"/>
-                              </w:rPr>
-                              <w:t xml:space="preserve"> While a</w:t>
-                            </w:r>
-                            <w:r>
-                              <w:rPr>
-                                <w:rFonts w:asciiTheme="majorBidi" w:hAnsiTheme="majorBidi" w:cstheme="majorBidi"/>
-                                <w:sz w:val="28"/>
-                                <w:szCs w:val="28"/>
-                              </w:rPr>
-                              <w:t xml:space="preserve"> rolling update gradually replaces old Pods with new Pods until all Pods run the new version.</w:t>
+                              <w:t>Rolling update focuses on gradually replacing Pods.</w:t>
+                            </w:r>
+                            <w:r>
+                              <w:rPr>
+                                <w:rFonts w:asciiTheme="majorBidi" w:hAnsiTheme="majorBidi" w:cstheme="majorBidi"/>
+                                <w:sz w:val="28"/>
+                                <w:szCs w:val="28"/>
+                              </w:rPr>
+                              <w:t xml:space="preserve"> </w:t>
+                            </w:r>
+                            <w:r>
+                              <w:rPr>
+                                <w:rFonts w:asciiTheme="majorBidi" w:hAnsiTheme="majorBidi" w:cstheme="majorBidi"/>
+                                <w:sz w:val="28"/>
+                                <w:szCs w:val="28"/>
+                              </w:rPr>
+                              <w:t>Canary update focuses on testing a new version on a small portion of users first.</w:t>
                             </w:r>
                           </w:p>
                           <w:p>
                             <w:pPr>
-                              <w:spacing w:after="60"/>
-                              <w:ind w:left="360"/>
-                              <w:jc w:val="both"/>
-                              <w:rPr>
-                                <w:rFonts w:asciiTheme="majorBidi" w:hAnsiTheme="majorBidi" w:cstheme="majorBidi"/>
-                                <w:sz w:val="28"/>
-                                <w:szCs w:val="28"/>
-                              </w:rPr>
-                            </w:pPr>
-                            <w:r>
-                              <w:rPr>
-                                <w:rFonts w:asciiTheme="majorBidi" w:hAnsiTheme="majorBidi" w:cstheme="majorBidi"/>
-                                <w:sz w:val="28"/>
-                                <w:szCs w:val="28"/>
-                              </w:rPr>
-                              <w:t>Rolling update focuses on gradually replacing Pods.</w:t>
-                            </w:r>
-                            <w:r>
-                              <w:rPr>
-                                <w:rFonts w:asciiTheme="majorBidi" w:hAnsiTheme="majorBidi" w:cstheme="majorBidi"/>
-                                <w:sz w:val="28"/>
-                                <w:szCs w:val="28"/>
-                              </w:rPr>
-                              <w:t xml:space="preserve"> </w:t>
-                            </w:r>
-                            <w:r>
-                              <w:rPr>
-                                <w:rFonts w:asciiTheme="majorBidi" w:hAnsiTheme="majorBidi" w:cstheme="majorBidi"/>
-                                <w:sz w:val="28"/>
-                                <w:szCs w:val="28"/>
-                              </w:rPr>
-                              <w:t>Canary update focuses on testing a new version on a small portion of users first.</w:t>
-                            </w:r>
-                          </w:p>
-                          <w:p>
-                            <w:pPr>
-                              <w:spacing w:after="60"/>
+                              <w:spacing w:after="0"/>
                               <w:rPr>
                                 <w:rFonts w:asciiTheme="majorBidi" w:hAnsiTheme="majorBidi" w:cstheme="majorBidi"/>
                                 <w:sz w:val="28"/>
@@ -11462,7 +11554,7 @@
           </mc:Choice>
           <mc:Fallback>
             <w:pict>
-              <v:rect w14:anchorId="69406AD8" id="Rectangle 16" o:spid="_x0000_s1033" style="position:absolute;left:0;text-align:left;margin-left:488.2pt;margin-top:28pt;width:539.4pt;height:550.3pt;z-index:251670528;visibility:visible;mso-wrap-style:square;mso-width-percent:0;mso-height-percent:0;mso-wrap-distance-left:9pt;mso-wrap-distance-top:0;mso-wrap-distance-right:9pt;mso-wrap-distance-bottom:0;mso-position-horizontal:right;mso-position-horizontal-relative:margin;mso-position-vertical:absolute;mso-position-vertical-relative:text;mso-width-percent:0;mso-height-percent:0;mso-width-relative:margin;mso-height-relative:margin;v-text-anchor:middle" o:gfxdata="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" fillcolor="#555 [2160]" strokecolor="black [3200]" strokeweight=".5pt">
+              <v:rect w14:anchorId="69406AD8" id="Rectangle 16" o:spid="_x0000_s1033" style="position:absolute;left:0;text-align:left;margin-left:488.2pt;margin-top:28pt;width:539.4pt;height:535.8pt;z-index:251670528;visibility:visible;mso-wrap-style:square;mso-width-percent:0;mso-height-percent:0;mso-wrap-distance-left:9pt;mso-wrap-distance-top:0;mso-wrap-distance-right:9pt;mso-wrap-distance-bottom:0;mso-position-horizontal:right;mso-position-horizontal-relative:margin;mso-position-vertical:absolute;mso-position-vertical-relative:text;mso-width-percent:0;mso-height-percent:0;mso-width-relative:margin;mso-height-relative:margin;v-text-anchor:middle" o:gfxdata="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" fillcolor="#555 [2160]" strokecolor="black [3200]" strokeweight=".5pt">
                 <v:fill color2="#313131 [2608]" rotate="t" colors="0 #9b9b9b;.5 #8e8e8e;1 #797979" focus="100%" type="gradient">
                   <o:fill v:ext="view" type="gradientUnscaled"/>
                 </v:fill>
@@ -11522,7 +11614,7 @@
                     </w:p>
                     <w:p>
                       <w:pPr>
-                        <w:spacing w:after="120"/>
+                        <w:spacing w:after="80"/>
                         <w:jc w:val="both"/>
                         <w:rPr>
                           <w:rFonts w:asciiTheme="majorBidi" w:hAnsiTheme="majorBidi" w:cstheme="majorBidi"/>
@@ -11562,7 +11654,7 @@
                           <w:ilvl w:val="0"/>
                           <w:numId w:val="57"/>
                         </w:numPr>
-                        <w:spacing w:after="60"/>
+                        <w:spacing w:after="0"/>
                         <w:ind w:left="360"/>
                         <w:jc w:val="both"/>
                         <w:rPr>
@@ -11578,6 +11670,22 @@
                           <w:szCs w:val="28"/>
                         </w:rPr>
                         <w:t>Rolling update can resemble canary, but it is not a full canary strategy.</w:t>
+                      </w:r>
+                      <w:r>
+                        <w:rPr>
+                          <w:rFonts w:asciiTheme="majorBidi" w:hAnsiTheme="majorBidi" w:cstheme="majorBidi"/>
+                          <w:sz w:val="28"/>
+                          <w:szCs w:val="28"/>
+                        </w:rPr>
+                        <w:t xml:space="preserve"> </w:t>
+                      </w:r>
+                      <w:r>
+                        <w:rPr>
+                          <w:rFonts w:asciiTheme="majorBidi" w:hAnsiTheme="majorBidi" w:cstheme="majorBidi"/>
+                          <w:sz w:val="28"/>
+                          <w:szCs w:val="28"/>
+                        </w:rPr>
+                        <w:t>A canary update intentionally releases the new version to a very small portion of traffic first, while the majority of users still use the old version. While a rolling update gradually replaces old Pods with new Pods until all Pods run the new version.</w:t>
                       </w:r>
                     </w:p>
                     <w:p>
@@ -11597,64 +11705,28 @@
                           <w:sz w:val="28"/>
                           <w:szCs w:val="28"/>
                         </w:rPr>
-                        <w:t>A canary update intentionally releases the new version to a very small portion of traffic first, while the majority of users still use the old version.</w:t>
-                      </w:r>
-                      <w:r>
-                        <w:rPr>
-                          <w:rFonts w:asciiTheme="majorBidi" w:hAnsiTheme="majorBidi" w:cstheme="majorBidi"/>
-                          <w:sz w:val="28"/>
-                          <w:szCs w:val="28"/>
-                        </w:rPr>
-                        <w:t xml:space="preserve"> While a</w:t>
-                      </w:r>
-                      <w:r>
-                        <w:rPr>
-                          <w:rFonts w:asciiTheme="majorBidi" w:hAnsiTheme="majorBidi" w:cstheme="majorBidi"/>
-                          <w:sz w:val="28"/>
-                          <w:szCs w:val="28"/>
-                        </w:rPr>
-                        <w:t xml:space="preserve"> rolling update gradually replaces old Pods with new Pods until all Pods run the new version.</w:t>
+                        <w:t>Rolling update focuses on gradually replacing Pods.</w:t>
+                      </w:r>
+                      <w:r>
+                        <w:rPr>
+                          <w:rFonts w:asciiTheme="majorBidi" w:hAnsiTheme="majorBidi" w:cstheme="majorBidi"/>
+                          <w:sz w:val="28"/>
+                          <w:szCs w:val="28"/>
+                        </w:rPr>
+                        <w:t xml:space="preserve"> </w:t>
+                      </w:r>
+                      <w:r>
+                        <w:rPr>
+                          <w:rFonts w:asciiTheme="majorBidi" w:hAnsiTheme="majorBidi" w:cstheme="majorBidi"/>
+                          <w:sz w:val="28"/>
+                          <w:szCs w:val="28"/>
+                        </w:rPr>
+                        <w:t>Canary update focuses on testing a new version on a small portion of users first.</w:t>
                       </w:r>
                     </w:p>
                     <w:p>
                       <w:pPr>
-                        <w:spacing w:after="60"/>
-                        <w:ind w:left="360"/>
-                        <w:jc w:val="both"/>
-                        <w:rPr>
-                          <w:rFonts w:asciiTheme="majorBidi" w:hAnsiTheme="majorBidi" w:cstheme="majorBidi"/>
-                          <w:sz w:val="28"/>
-                          <w:szCs w:val="28"/>
-                        </w:rPr>
-                      </w:pPr>
-                      <w:r>
-                        <w:rPr>
-                          <w:rFonts w:asciiTheme="majorBidi" w:hAnsiTheme="majorBidi" w:cstheme="majorBidi"/>
-                          <w:sz w:val="28"/>
-                          <w:szCs w:val="28"/>
-                        </w:rPr>
-                        <w:t>Rolling update focuses on gradually replacing Pods.</w:t>
-                      </w:r>
-                      <w:r>
-                        <w:rPr>
-                          <w:rFonts w:asciiTheme="majorBidi" w:hAnsiTheme="majorBidi" w:cstheme="majorBidi"/>
-                          <w:sz w:val="28"/>
-                          <w:szCs w:val="28"/>
-                        </w:rPr>
-                        <w:t xml:space="preserve"> </w:t>
-                      </w:r>
-                      <w:r>
-                        <w:rPr>
-                          <w:rFonts w:asciiTheme="majorBidi" w:hAnsiTheme="majorBidi" w:cstheme="majorBidi"/>
-                          <w:sz w:val="28"/>
-                          <w:szCs w:val="28"/>
-                        </w:rPr>
-                        <w:t>Canary update focuses on testing a new version on a small portion of users first.</w:t>
-                      </w:r>
-                    </w:p>
-                    <w:p>
-                      <w:pPr>
-                        <w:spacing w:after="60"/>
+                        <w:spacing w:after="0"/>
                         <w:rPr>
                           <w:rFonts w:asciiTheme="majorBidi" w:hAnsiTheme="majorBidi" w:cstheme="majorBidi"/>
                           <w:sz w:val="28"/>
@@ -12106,6 +12178,244 @@
           <w:szCs w:val="28"/>
         </w:rPr>
       </w:pPr>
+      <w:r>
+        <w:rPr>
+          <w:rFonts w:asciiTheme="majorBidi" w:hAnsiTheme="majorBidi" w:cstheme="majorBidi"/>
+          <w:noProof/>
+          <w:sz w:val="28"/>
+          <w:szCs w:val="28"/>
+        </w:rPr>
+        <mc:AlternateContent>
+          <mc:Choice Requires="wps">
+            <w:drawing>
+              <wp:anchor distT="0" distB="0" distL="114300" distR="114300" simplePos="0" relativeHeight="251682816" behindDoc="0" locked="0" layoutInCell="1" allowOverlap="1" wp14:anchorId="1D33CCC7" wp14:editId="56876E5A">
+                <wp:simplePos x="0" y="0"/>
+                <wp:positionH relativeFrom="margin">
+                  <wp:align>right</wp:align>
+                </wp:positionH>
+                <wp:positionV relativeFrom="paragraph">
+                  <wp:posOffset>107315</wp:posOffset>
+                </wp:positionV>
+                <wp:extent cx="6842760" cy="1112520"/>
+                <wp:effectExtent l="0" t="0" r="15240" b="11430"/>
+                <wp:wrapNone/>
+                <wp:docPr id="66070506" name="Rectangle 23"/>
+                <wp:cNvGraphicFramePr/>
+                <a:graphic xmlns:a="http://schemas.openxmlformats.org/drawingml/2006/main">
+                  <a:graphicData uri="http://schemas.microsoft.com/office/word/2010/wordprocessingShape">
+                    <wps:wsp>
+                      <wps:cNvSpPr/>
+                      <wps:spPr>
+                        <a:xfrm>
+                          <a:off x="0" y="0"/>
+                          <a:ext cx="6842760" cy="1112520"/>
+                        </a:xfrm>
+                        <a:prstGeom prst="rect">
+                          <a:avLst/>
+                        </a:prstGeom>
+                      </wps:spPr>
+                      <wps:style>
+                        <a:lnRef idx="1">
+                          <a:schemeClr val="dk1"/>
+                        </a:lnRef>
+                        <a:fillRef idx="2">
+                          <a:schemeClr val="dk1"/>
+                        </a:fillRef>
+                        <a:effectRef idx="1">
+                          <a:schemeClr val="dk1"/>
+                        </a:effectRef>
+                        <a:fontRef idx="minor">
+                          <a:schemeClr val="dk1"/>
+                        </a:fontRef>
+                      </wps:style>
+                      <wps:txbx>
+                        <w:txbxContent>
+                          <w:p>
+                            <w:pPr>
+                              <w:spacing w:after="0"/>
+                              <w:jc w:val="both"/>
+                              <w:rPr>
+                                <w:rFonts w:asciiTheme="majorBidi" w:hAnsiTheme="majorBidi" w:cstheme="majorBidi"/>
+                                <w:b/>
+                                <w:bCs/>
+                                <w:sz w:val="36"/>
+                                <w:szCs w:val="36"/>
+                              </w:rPr>
+                            </w:pPr>
+                            <w:r>
+                              <w:rPr>
+                                <w:rFonts w:asciiTheme="majorBidi" w:hAnsiTheme="majorBidi" w:cstheme="majorBidi"/>
+                                <w:b/>
+                                <w:bCs/>
+                                <w:sz w:val="36"/>
+                                <w:szCs w:val="36"/>
+                              </w:rPr>
+                              <w:t>Blue‑Green Deployment</w:t>
+                            </w:r>
+                          </w:p>
+                          <w:p>
+                            <w:pPr>
+                              <w:spacing w:after="120"/>
+                              <w:jc w:val="both"/>
+                              <w:rPr>
+                                <w:rFonts w:asciiTheme="majorBidi" w:hAnsiTheme="majorBidi" w:cstheme="majorBidi"/>
+                                <w:sz w:val="28"/>
+                                <w:szCs w:val="28"/>
+                              </w:rPr>
+                            </w:pPr>
+                            <w:r>
+                              <w:rPr>
+                                <w:rFonts w:asciiTheme="majorBidi" w:hAnsiTheme="majorBidi" w:cstheme="majorBidi"/>
+                                <w:sz w:val="28"/>
+                                <w:szCs w:val="28"/>
+                              </w:rPr>
+                              <w:t>Blue‑Green deployment is a release strategy for updating applications with zero downtime and instant rollback capability.</w:t>
+                            </w:r>
+                            <w:r>
+                              <w:rPr>
+                                <w:rFonts w:asciiTheme="majorBidi" w:hAnsiTheme="majorBidi" w:cstheme="majorBidi"/>
+                                <w:sz w:val="28"/>
+                                <w:szCs w:val="28"/>
+                              </w:rPr>
+                              <w:t xml:space="preserve"> </w:t>
+                            </w:r>
+                            <w:r>
+                              <w:rPr>
+                                <w:rFonts w:asciiTheme="majorBidi" w:hAnsiTheme="majorBidi" w:cstheme="majorBidi"/>
+                                <w:sz w:val="28"/>
+                                <w:szCs w:val="28"/>
+                              </w:rPr>
+                              <w:t>It works by running two identical environments called Blue and Green and switching traffic between them.</w:t>
+                            </w:r>
+                          </w:p>
+                          <w:p>
+                            <w:pPr>
+                              <w:jc w:val="center"/>
+                            </w:pPr>
+                          </w:p>
+                        </w:txbxContent>
+                      </wps:txbx>
+                      <wps:bodyPr rot="0" spcFirstLastPara="0" vertOverflow="overflow" horzOverflow="overflow" vert="horz" wrap="square" lIns="91440" tIns="45720" rIns="91440" bIns="45720" numCol="1" spcCol="0" rtlCol="0" fromWordArt="0" anchor="ctr" anchorCtr="0" forceAA="0" compatLnSpc="1">
+                        <a:prstTxWarp prst="textNoShape">
+                          <a:avLst/>
+                        </a:prstTxWarp>
+                        <a:noAutofit/>
+                      </wps:bodyPr>
+                    </wps:wsp>
+                  </a:graphicData>
+                </a:graphic>
+                <wp14:sizeRelH relativeFrom="margin">
+                  <wp14:pctWidth>0</wp14:pctWidth>
+                </wp14:sizeRelH>
+                <wp14:sizeRelV relativeFrom="margin">
+                  <wp14:pctHeight>0</wp14:pctHeight>
+                </wp14:sizeRelV>
+              </wp:anchor>
+            </w:drawing>
+          </mc:Choice>
+          <mc:Fallback>
+            <w:pict>
+              <v:rect w14:anchorId="1D33CCC7" id="Rectangle 23" o:spid="_x0000_s1034" style="position:absolute;left:0;text-align:left;margin-left:487.6pt;margin-top:8.45pt;width:538.8pt;height:87.6pt;z-index:251682816;visibility:visible;mso-wrap-style:square;mso-width-percent:0;mso-height-percent:0;mso-wrap-distance-left:9pt;mso-wrap-distance-top:0;mso-wrap-distance-right:9pt;mso-wrap-distance-bottom:0;mso-position-horizontal:right;mso-position-horizontal-relative:margin;mso-position-vertical:absolute;mso-position-vertical-relative:text;mso-width-percent:0;mso-height-percent:0;mso-width-relative:margin;mso-height-relative:margin;v-text-anchor:middle" o:gfxdata="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" fillcolor="#555 [2160]" strokecolor="black [3200]" strokeweight=".5pt">
+                <v:fill color2="#313131 [2608]" rotate="t" colors="0 #9b9b9b;.5 #8e8e8e;1 #797979" focus="100%" type="gradient">
+                  <o:fill v:ext="view" type="gradientUnscaled"/>
+                </v:fill>
+                <v:textbox>
+                  <w:txbxContent>
+                    <w:p>
+                      <w:pPr>
+                        <w:spacing w:after="0"/>
+                        <w:jc w:val="both"/>
+                        <w:rPr>
+                          <w:rFonts w:asciiTheme="majorBidi" w:hAnsiTheme="majorBidi" w:cstheme="majorBidi"/>
+                          <w:b/>
+                          <w:bCs/>
+                          <w:sz w:val="36"/>
+                          <w:szCs w:val="36"/>
+                        </w:rPr>
+                      </w:pPr>
+                      <w:r>
+                        <w:rPr>
+                          <w:rFonts w:asciiTheme="majorBidi" w:hAnsiTheme="majorBidi" w:cstheme="majorBidi"/>
+                          <w:b/>
+                          <w:bCs/>
+                          <w:sz w:val="36"/>
+                          <w:szCs w:val="36"/>
+                        </w:rPr>
+                        <w:t>Blue‑Green Deployment</w:t>
+                      </w:r>
+                    </w:p>
+                    <w:p>
+                      <w:pPr>
+                        <w:spacing w:after="120"/>
+                        <w:jc w:val="both"/>
+                        <w:rPr>
+                          <w:rFonts w:asciiTheme="majorBidi" w:hAnsiTheme="majorBidi" w:cstheme="majorBidi"/>
+                          <w:sz w:val="28"/>
+                          <w:szCs w:val="28"/>
+                        </w:rPr>
+                      </w:pPr>
+                      <w:r>
+                        <w:rPr>
+                          <w:rFonts w:asciiTheme="majorBidi" w:hAnsiTheme="majorBidi" w:cstheme="majorBidi"/>
+                          <w:sz w:val="28"/>
+                          <w:szCs w:val="28"/>
+                        </w:rPr>
+                        <w:t>Blue‑Green deployment is a release strategy for updating applications with zero downtime and instant rollback capability.</w:t>
+                      </w:r>
+                      <w:r>
+                        <w:rPr>
+                          <w:rFonts w:asciiTheme="majorBidi" w:hAnsiTheme="majorBidi" w:cstheme="majorBidi"/>
+                          <w:sz w:val="28"/>
+                          <w:szCs w:val="28"/>
+                        </w:rPr>
+                        <w:t xml:space="preserve"> </w:t>
+                      </w:r>
+                      <w:r>
+                        <w:rPr>
+                          <w:rFonts w:asciiTheme="majorBidi" w:hAnsiTheme="majorBidi" w:cstheme="majorBidi"/>
+                          <w:sz w:val="28"/>
+                          <w:szCs w:val="28"/>
+                        </w:rPr>
+                        <w:t>It works by running two identical environments called Blue and Green and switching traffic between them.</w:t>
+                      </w:r>
+                    </w:p>
+                    <w:p>
+                      <w:pPr>
+                        <w:jc w:val="center"/>
+                      </w:pPr>
+                    </w:p>
+                  </w:txbxContent>
+                </v:textbox>
+                <w10:wrap anchorx="margin"/>
+              </v:rect>
+            </w:pict>
+          </mc:Fallback>
+        </mc:AlternateContent>
+      </w:r>
+    </w:p>
+    <w:p>
+      <w:pPr>
+        <w:jc w:val="both"/>
+        <w:rPr>
+          <w:rFonts w:asciiTheme="majorBidi" w:hAnsiTheme="majorBidi" w:cstheme="majorBidi"/>
+          <w:b/>
+          <w:bCs/>
+          <w:sz w:val="36"/>
+          <w:szCs w:val="36"/>
+        </w:rPr>
+      </w:pPr>
+    </w:p>
+    <w:p>
+      <w:pPr>
+        <w:jc w:val="both"/>
+        <w:rPr>
+          <w:rFonts w:asciiTheme="majorBidi" w:hAnsiTheme="majorBidi" w:cstheme="majorBidi"/>
+          <w:b/>
+          <w:bCs/>
+          <w:sz w:val="36"/>
+          <w:szCs w:val="36"/>
+        </w:rPr>
+      </w:pPr>
     </w:p>
     <w:p>
       <w:pPr>
@@ -12131,13 +12441,13 @@
         <mc:AlternateContent>
           <mc:Choice Requires="wps">
             <w:drawing>
-              <wp:anchor distT="0" distB="0" distL="114300" distR="114300" simplePos="0" relativeHeight="251679744" behindDoc="0" locked="0" layoutInCell="1" allowOverlap="1" wp14:anchorId="06D43647" wp14:editId="5CF87850">
+              <wp:anchor distT="0" distB="0" distL="114300" distR="114300" simplePos="0" relativeHeight="251679744" behindDoc="0" locked="0" layoutInCell="1" allowOverlap="1" wp14:anchorId="06D43647" wp14:editId="5085118B">
                 <wp:simplePos x="0" y="0"/>
                 <wp:positionH relativeFrom="margin">
-                  <wp:align>left</wp:align>
+                  <wp:align>right</wp:align>
                 </wp:positionH>
                 <wp:positionV relativeFrom="paragraph">
-                  <wp:posOffset>7620</wp:posOffset>
+                  <wp:posOffset>10160</wp:posOffset>
                 </wp:positionV>
                 <wp:extent cx="6850380" cy="9105900"/>
                 <wp:effectExtent l="0" t="0" r="26670" b="19050"/>
@@ -12175,65 +12485,7 @@
                         <w:txbxContent>
                           <w:p>
                             <w:pPr>
-                              <w:spacing w:after="60"/>
-                              <w:jc w:val="both"/>
-                              <w:rPr>
-                                <w:rFonts w:asciiTheme="majorBidi" w:hAnsiTheme="majorBidi" w:cstheme="majorBidi"/>
-                                <w:b/>
-                                <w:bCs/>
-                                <w:sz w:val="36"/>
-                                <w:szCs w:val="36"/>
-                              </w:rPr>
-                            </w:pPr>
-                            <w:r>
-                              <w:rPr>
-                                <w:rFonts w:asciiTheme="majorBidi" w:hAnsiTheme="majorBidi" w:cstheme="majorBidi"/>
-                                <w:b/>
-                                <w:bCs/>
-                                <w:sz w:val="36"/>
-                                <w:szCs w:val="36"/>
-                              </w:rPr>
-                              <w:t>Blue‑Green Deployment</w:t>
-                            </w:r>
-                          </w:p>
-                          <w:p>
-                            <w:pPr>
-                              <w:spacing w:after="120"/>
-                              <w:jc w:val="both"/>
-                              <w:rPr>
-                                <w:rFonts w:asciiTheme="majorBidi" w:hAnsiTheme="majorBidi" w:cstheme="majorBidi"/>
-                                <w:sz w:val="28"/>
-                                <w:szCs w:val="28"/>
-                              </w:rPr>
-                            </w:pPr>
-                            <w:r>
-                              <w:rPr>
-                                <w:rFonts w:asciiTheme="majorBidi" w:hAnsiTheme="majorBidi" w:cstheme="majorBidi"/>
-                                <w:sz w:val="28"/>
-                                <w:szCs w:val="28"/>
-                              </w:rPr>
-                              <w:t>Blue‑Green deployment is a release strategy for updating applications with zero downtime and instant rollback capability.</w:t>
-                            </w:r>
-                            <w:r>
-                              <w:rPr>
-                                <w:rFonts w:asciiTheme="majorBidi" w:hAnsiTheme="majorBidi" w:cstheme="majorBidi"/>
-                                <w:sz w:val="28"/>
-                                <w:szCs w:val="28"/>
-                              </w:rPr>
-                              <w:t xml:space="preserve"> </w:t>
-                            </w:r>
-                            <w:r>
-                              <w:rPr>
-                                <w:rFonts w:asciiTheme="majorBidi" w:hAnsiTheme="majorBidi" w:cstheme="majorBidi"/>
-                                <w:sz w:val="28"/>
-                                <w:szCs w:val="28"/>
-                              </w:rPr>
-                              <w:t>It works by running two identical environments called Blue and Green and switching traffic between them.</w:t>
-                            </w:r>
-                          </w:p>
-                          <w:p>
-                            <w:pPr>
-                              <w:spacing w:after="60"/>
+                              <w:spacing w:after="0"/>
                               <w:jc w:val="both"/>
                               <w:rPr>
                                 <w:rFonts w:asciiTheme="majorBidi" w:hAnsiTheme="majorBidi" w:cstheme="majorBidi"/>
@@ -12286,7 +12538,7 @@
                                 <w:ilvl w:val="0"/>
                                 <w:numId w:val="73"/>
                               </w:numPr>
-                              <w:spacing w:after="60"/>
+                              <w:spacing w:after="0"/>
                               <w:ind w:left="360"/>
                               <w:jc w:val="both"/>
                               <w:rPr>
@@ -12368,15 +12620,15 @@
                                 <w:sz w:val="28"/>
                                 <w:szCs w:val="28"/>
                               </w:rPr>
-                              <w:t xml:space="preserve">If something goes wrong, you can switch traffic back to Blue just as quickly </w:t>
-                            </w:r>
-                            <w:r>
-                              <w:rPr>
-                                <w:rFonts w:asciiTheme="majorBidi" w:hAnsiTheme="majorBidi" w:cstheme="majorBidi"/>
-                                <w:sz w:val="28"/>
-                                <w:szCs w:val="28"/>
-                              </w:rPr>
-                              <w:t>-</w:t>
+                              <w:t>If something goes wrong, you can switch traffic back to Blue just as quickly</w:t>
+                            </w:r>
+                            <w:r>
+                              <w:rPr>
+                                <w:rFonts w:asciiTheme="majorBidi" w:hAnsiTheme="majorBidi" w:cstheme="majorBidi"/>
+                                <w:sz w:val="28"/>
+                                <w:szCs w:val="28"/>
+                              </w:rPr>
+                              <w:t>.</w:t>
                             </w:r>
                             <w:r>
                               <w:rPr>
@@ -12745,7 +12997,7 @@
                                 <w:ilvl w:val="0"/>
                                 <w:numId w:val="74"/>
                               </w:numPr>
-                              <w:spacing w:after="120"/>
+                              <w:spacing w:after="60"/>
                               <w:ind w:left="360"/>
                               <w:jc w:val="both"/>
                               <w:rPr>
@@ -12797,6 +13049,39 @@
                                 <w:szCs w:val="28"/>
                               </w:rPr>
                               <w:t xml:space="preserve"> environment or prepare it for the next version.</w:t>
+                            </w:r>
+                          </w:p>
+                          <w:p>
+                            <w:pPr>
+                              <w:spacing w:after="0"/>
+                              <w:jc w:val="both"/>
+                              <w:rPr>
+                                <w:rFonts w:asciiTheme="majorBidi" w:hAnsiTheme="majorBidi" w:cstheme="majorBidi"/>
+                                <w:b/>
+                                <w:bCs/>
+                                <w:sz w:val="32"/>
+                                <w:szCs w:val="32"/>
+                              </w:rPr>
+                            </w:pPr>
+                            <w:r>
+                              <w:rPr>
+                                <w:rFonts w:asciiTheme="majorBidi" w:hAnsiTheme="majorBidi" w:cstheme="majorBidi"/>
+                                <w:b/>
+                                <w:bCs/>
+                                <w:sz w:val="32"/>
+                                <w:szCs w:val="32"/>
+                              </w:rPr>
+                              <w:t>Blue‑Green in Kubernetes</w:t>
+                            </w:r>
+                            <w:r>
+                              <w:rPr>
+                                <w:rFonts w:asciiTheme="majorBidi" w:hAnsiTheme="majorBidi" w:cstheme="majorBidi"/>
+                                <w:b/>
+                                <w:bCs/>
+                                <w:sz w:val="32"/>
+                                <w:szCs w:val="32"/>
+                              </w:rPr>
+                              <w:t>:</w:t>
                             </w:r>
                           </w:p>
                           <w:p>
@@ -12805,31 +13090,56 @@
                               <w:jc w:val="both"/>
                               <w:rPr>
                                 <w:rFonts w:asciiTheme="majorBidi" w:hAnsiTheme="majorBidi" w:cstheme="majorBidi"/>
-                                <w:b/>
-                                <w:bCs/>
-                                <w:sz w:val="32"/>
-                                <w:szCs w:val="32"/>
+                                <w:sz w:val="28"/>
+                                <w:szCs w:val="28"/>
                               </w:rPr>
                             </w:pPr>
                             <w:r>
                               <w:rPr>
                                 <w:rFonts w:asciiTheme="majorBidi" w:hAnsiTheme="majorBidi" w:cstheme="majorBidi"/>
-                                <w:b/>
-                                <w:bCs/>
-                                <w:sz w:val="32"/>
-                                <w:szCs w:val="32"/>
-                              </w:rPr>
-                              <w:t>Blue‑Green in Kubernetes</w:t>
-                            </w:r>
-                            <w:r>
-                              <w:rPr>
-                                <w:rFonts w:asciiTheme="majorBidi" w:hAnsiTheme="majorBidi" w:cstheme="majorBidi"/>
-                                <w:b/>
-                                <w:bCs/>
-                                <w:sz w:val="32"/>
-                                <w:szCs w:val="32"/>
-                              </w:rPr>
-                              <w:t>:</w:t>
+                                <w:sz w:val="28"/>
+                                <w:szCs w:val="28"/>
+                              </w:rPr>
+                              <w:t>In Kubernetes, Blue‑Green can be implemented with two Deployments and one Service.</w:t>
+                            </w:r>
+                          </w:p>
+                          <w:p>
+                            <w:pPr>
+                              <w:spacing w:after="0"/>
+                              <w:jc w:val="both"/>
+                              <w:rPr>
+                                <w:rFonts w:asciiTheme="majorBidi" w:hAnsiTheme="majorBidi" w:cstheme="majorBidi"/>
+                                <w:sz w:val="28"/>
+                                <w:szCs w:val="28"/>
+                              </w:rPr>
+                            </w:pPr>
+                            <w:r>
+                              <w:rPr>
+                                <w:rFonts w:asciiTheme="majorBidi" w:hAnsiTheme="majorBidi" w:cstheme="majorBidi"/>
+                                <w:sz w:val="28"/>
+                                <w:szCs w:val="28"/>
+                              </w:rPr>
+                              <w:t xml:space="preserve">Initially, the Service selector points to </w:t>
+                            </w:r>
+                            <w:r>
+                              <w:rPr>
+                                <w:rFonts w:asciiTheme="majorBidi" w:hAnsiTheme="majorBidi" w:cstheme="majorBidi"/>
+                                <w:b/>
+                                <w:bCs/>
+                                <w:i/>
+                                <w:iCs/>
+                                <w:sz w:val="28"/>
+                                <w:szCs w:val="28"/>
+                              </w:rPr>
+                              <w:t>version: blue</w:t>
+                            </w:r>
+                            <w:r>
+                              <w:rPr>
+                                <w:rFonts w:asciiTheme="majorBidi" w:hAnsiTheme="majorBidi" w:cstheme="majorBidi"/>
+                                <w:sz w:val="28"/>
+                                <w:szCs w:val="28"/>
+                              </w:rPr>
+                              <w:t>.</w:t>
                             </w:r>
                           </w:p>
                           <w:p>
@@ -12848,7 +13158,64 @@
                                 <w:sz w:val="28"/>
                                 <w:szCs w:val="28"/>
                               </w:rPr>
-                              <w:t>In Kubernetes, Blue‑Green can be implemented with two Deployments and one Service.</w:t>
+                              <w:t xml:space="preserve">When you’re ready to release, you simply update the Service selector to </w:t>
+                            </w:r>
+                            <w:r>
+                              <w:rPr>
+                                <w:rFonts w:asciiTheme="majorBidi" w:hAnsiTheme="majorBidi" w:cstheme="majorBidi"/>
+                                <w:b/>
+                                <w:bCs/>
+                                <w:i/>
+                                <w:iCs/>
+                                <w:sz w:val="28"/>
+                                <w:szCs w:val="28"/>
+                              </w:rPr>
+                              <w:t>version: green</w:t>
+                            </w:r>
+                            <w:r>
+                              <w:rPr>
+                                <w:rFonts w:asciiTheme="majorBidi" w:hAnsiTheme="majorBidi" w:cstheme="majorBidi"/>
+                                <w:sz w:val="28"/>
+                                <w:szCs w:val="28"/>
+                              </w:rPr>
+                              <w:t>.</w:t>
+                            </w:r>
+                          </w:p>
+                          <w:p>
+                            <w:pPr>
+                              <w:spacing w:after="0"/>
+                              <w:jc w:val="both"/>
+                              <w:rPr>
+                                <w:rFonts w:asciiTheme="majorBidi" w:hAnsiTheme="majorBidi" w:cstheme="majorBidi"/>
+                                <w:sz w:val="28"/>
+                                <w:szCs w:val="28"/>
+                              </w:rPr>
+                            </w:pPr>
+                            <w:r>
+                              <w:rPr>
+                                <w:rFonts w:asciiTheme="majorBidi" w:hAnsiTheme="majorBidi" w:cstheme="majorBidi"/>
+                                <w:sz w:val="28"/>
+                                <w:szCs w:val="28"/>
+                              </w:rPr>
+                              <w:t xml:space="preserve">That instantly transfers all traffic to the </w:t>
+                            </w:r>
+                            <w:proofErr w:type="gramStart"/>
+                            <w:r>
+                              <w:rPr>
+                                <w:rFonts w:asciiTheme="majorBidi" w:hAnsiTheme="majorBidi" w:cstheme="majorBidi"/>
+                                <w:sz w:val="28"/>
+                                <w:szCs w:val="28"/>
+                              </w:rPr>
+                              <w:t>Green</w:t>
+                            </w:r>
+                            <w:proofErr w:type="gramEnd"/>
+                            <w:r>
+                              <w:rPr>
+                                <w:rFonts w:asciiTheme="majorBidi" w:hAnsiTheme="majorBidi" w:cstheme="majorBidi"/>
+                                <w:sz w:val="28"/>
+                                <w:szCs w:val="28"/>
+                              </w:rPr>
+                              <w:t xml:space="preserve"> pods.</w:t>
                             </w:r>
                           </w:p>
                           <w:p>
@@ -12867,127 +13234,12 @@
                                 <w:sz w:val="28"/>
                                 <w:szCs w:val="28"/>
                               </w:rPr>
-                              <w:t xml:space="preserve">Initially, the Service selector points to </w:t>
-                            </w:r>
-                            <w:r>
-                              <w:rPr>
-                                <w:rFonts w:asciiTheme="majorBidi" w:hAnsiTheme="majorBidi" w:cstheme="majorBidi"/>
-                                <w:b/>
-                                <w:bCs/>
-                                <w:i/>
-                                <w:iCs/>
-                                <w:sz w:val="28"/>
-                                <w:szCs w:val="28"/>
-                              </w:rPr>
-                              <w:t>version: blue</w:t>
-                            </w:r>
-                            <w:r>
-                              <w:rPr>
-                                <w:rFonts w:asciiTheme="majorBidi" w:hAnsiTheme="majorBidi" w:cstheme="majorBidi"/>
-                                <w:sz w:val="28"/>
-                                <w:szCs w:val="28"/>
-                              </w:rPr>
-                              <w:t>.</w:t>
+                              <w:t>If there’s an issue → change it back to version: blue.</w:t>
                             </w:r>
                           </w:p>
                           <w:p>
                             <w:pPr>
-                              <w:spacing w:after="60"/>
-                              <w:jc w:val="both"/>
-                              <w:rPr>
-                                <w:rFonts w:asciiTheme="majorBidi" w:hAnsiTheme="majorBidi" w:cstheme="majorBidi"/>
-                                <w:sz w:val="28"/>
-                                <w:szCs w:val="28"/>
-                              </w:rPr>
-                            </w:pPr>
-                            <w:r>
-                              <w:rPr>
-                                <w:rFonts w:asciiTheme="majorBidi" w:hAnsiTheme="majorBidi" w:cstheme="majorBidi"/>
-                                <w:sz w:val="28"/>
-                                <w:szCs w:val="28"/>
-                              </w:rPr>
-                              <w:t xml:space="preserve">When you’re ready to release, you simply update the Service selector to </w:t>
-                            </w:r>
-                            <w:r>
-                              <w:rPr>
-                                <w:rFonts w:asciiTheme="majorBidi" w:hAnsiTheme="majorBidi" w:cstheme="majorBidi"/>
-                                <w:b/>
-                                <w:bCs/>
-                                <w:i/>
-                                <w:iCs/>
-                                <w:sz w:val="28"/>
-                                <w:szCs w:val="28"/>
-                              </w:rPr>
-                              <w:t>version: green</w:t>
-                            </w:r>
-                            <w:r>
-                              <w:rPr>
-                                <w:rFonts w:asciiTheme="majorBidi" w:hAnsiTheme="majorBidi" w:cstheme="majorBidi"/>
-                                <w:sz w:val="28"/>
-                                <w:szCs w:val="28"/>
-                              </w:rPr>
-                              <w:t>.</w:t>
-                            </w:r>
-                          </w:p>
-                          <w:p>
-                            <w:pPr>
-                              <w:spacing w:after="60"/>
-                              <w:jc w:val="both"/>
-                              <w:rPr>
-                                <w:rFonts w:asciiTheme="majorBidi" w:hAnsiTheme="majorBidi" w:cstheme="majorBidi"/>
-                                <w:sz w:val="28"/>
-                                <w:szCs w:val="28"/>
-                              </w:rPr>
-                            </w:pPr>
-                            <w:r>
-                              <w:rPr>
-                                <w:rFonts w:asciiTheme="majorBidi" w:hAnsiTheme="majorBidi" w:cstheme="majorBidi"/>
-                                <w:sz w:val="28"/>
-                                <w:szCs w:val="28"/>
-                              </w:rPr>
-                              <w:t xml:space="preserve">That instantly transfers all traffic to the </w:t>
-                            </w:r>
-                            <w:proofErr w:type="gramStart"/>
-                            <w:r>
-                              <w:rPr>
-                                <w:rFonts w:asciiTheme="majorBidi" w:hAnsiTheme="majorBidi" w:cstheme="majorBidi"/>
-                                <w:sz w:val="28"/>
-                                <w:szCs w:val="28"/>
-                              </w:rPr>
-                              <w:t>Green</w:t>
-                            </w:r>
-                            <w:proofErr w:type="gramEnd"/>
-                            <w:r>
-                              <w:rPr>
-                                <w:rFonts w:asciiTheme="majorBidi" w:hAnsiTheme="majorBidi" w:cstheme="majorBidi"/>
-                                <w:sz w:val="28"/>
-                                <w:szCs w:val="28"/>
-                              </w:rPr>
-                              <w:t xml:space="preserve"> pods.</w:t>
-                            </w:r>
-                          </w:p>
-                          <w:p>
-                            <w:pPr>
-                              <w:spacing w:after="120"/>
-                              <w:jc w:val="both"/>
-                              <w:rPr>
-                                <w:rFonts w:asciiTheme="majorBidi" w:hAnsiTheme="majorBidi" w:cstheme="majorBidi"/>
-                                <w:sz w:val="28"/>
-                                <w:szCs w:val="28"/>
-                              </w:rPr>
-                            </w:pPr>
-                            <w:r>
-                              <w:rPr>
-                                <w:rFonts w:asciiTheme="majorBidi" w:hAnsiTheme="majorBidi" w:cstheme="majorBidi"/>
-                                <w:sz w:val="28"/>
-                                <w:szCs w:val="28"/>
-                              </w:rPr>
-                              <w:t>If there’s an issue → change it back to version: blue.</w:t>
-                            </w:r>
-                          </w:p>
-                          <w:p>
-                            <w:pPr>
-                              <w:spacing w:after="120"/>
+                              <w:spacing w:after="0"/>
                               <w:jc w:val="both"/>
                               <w:rPr>
                                 <w:rFonts w:asciiTheme="majorBidi" w:hAnsiTheme="majorBidi" w:cstheme="majorBidi"/>
@@ -13036,10 +13288,20 @@
                             <w:r>
                               <w:rPr>
                                 <w:rFonts w:asciiTheme="majorBidi" w:hAnsiTheme="majorBidi" w:cstheme="majorBidi"/>
-                                <w:sz w:val="28"/>
-                                <w:szCs w:val="28"/>
-                              </w:rPr>
-                              <w:t>Zero downtime → Traffic is switched instantly; no overlap of half‑updated Pods.</w:t>
+                                <w:b/>
+                                <w:bCs/>
+                                <w:sz w:val="28"/>
+                                <w:szCs w:val="28"/>
+                              </w:rPr>
+                              <w:t>Zero downtime</w:t>
+                            </w:r>
+                            <w:r>
+                              <w:rPr>
+                                <w:rFonts w:asciiTheme="majorBidi" w:hAnsiTheme="majorBidi" w:cstheme="majorBidi"/>
+                                <w:sz w:val="28"/>
+                                <w:szCs w:val="28"/>
+                              </w:rPr>
+                              <w:t xml:space="preserve"> → Traffic is switched instantly; no overlap of half‑updated Pods.</w:t>
                             </w:r>
                           </w:p>
                           <w:p>
@@ -13060,10 +13322,158 @@
                             <w:r>
                               <w:rPr>
                                 <w:rFonts w:asciiTheme="majorBidi" w:hAnsiTheme="majorBidi" w:cstheme="majorBidi"/>
-                                <w:sz w:val="28"/>
-                                <w:szCs w:val="28"/>
-                              </w:rPr>
-                              <w:t>Instant rollback → Just re‑point the Service or load balancer.</w:t>
+                                <w:b/>
+                                <w:bCs/>
+                                <w:sz w:val="28"/>
+                                <w:szCs w:val="28"/>
+                              </w:rPr>
+                              <w:t>Instant rollback</w:t>
+                            </w:r>
+                            <w:r>
+                              <w:rPr>
+                                <w:rFonts w:asciiTheme="majorBidi" w:hAnsiTheme="majorBidi" w:cstheme="majorBidi"/>
+                                <w:sz w:val="28"/>
+                                <w:szCs w:val="28"/>
+                              </w:rPr>
+                              <w:t xml:space="preserve"> → Just re‑point the Service or load balancer.</w:t>
+                            </w:r>
+                          </w:p>
+                          <w:p>
+                            <w:pPr>
+                              <w:pStyle w:val="ListParagraph"/>
+                              <w:numPr>
+                                <w:ilvl w:val="0"/>
+                                <w:numId w:val="76"/>
+                              </w:numPr>
+                              <w:ind w:left="360"/>
+                              <w:jc w:val="both"/>
+                              <w:rPr>
+                                <w:rFonts w:asciiTheme="majorBidi" w:hAnsiTheme="majorBidi" w:cstheme="majorBidi"/>
+                                <w:sz w:val="28"/>
+                                <w:szCs w:val="28"/>
+                              </w:rPr>
+                            </w:pPr>
+                            <w:r>
+                              <w:rPr>
+                                <w:rFonts w:asciiTheme="majorBidi" w:hAnsiTheme="majorBidi" w:cstheme="majorBidi"/>
+                                <w:b/>
+                                <w:bCs/>
+                                <w:sz w:val="28"/>
+                                <w:szCs w:val="28"/>
+                              </w:rPr>
+                              <w:t>Safe testing</w:t>
+                            </w:r>
+                            <w:r>
+                              <w:rPr>
+                                <w:rFonts w:asciiTheme="majorBidi" w:hAnsiTheme="majorBidi" w:cstheme="majorBidi"/>
+                                <w:sz w:val="28"/>
+                                <w:szCs w:val="28"/>
+                              </w:rPr>
+                              <w:t xml:space="preserve"> → The Green environment runs side‑by‑side - can be validated before serving users.</w:t>
+                            </w:r>
+                          </w:p>
+                          <w:p>
+                            <w:pPr>
+                              <w:pStyle w:val="ListParagraph"/>
+                              <w:numPr>
+                                <w:ilvl w:val="0"/>
+                                <w:numId w:val="76"/>
+                              </w:numPr>
+                              <w:spacing w:after="60"/>
+                              <w:ind w:left="360"/>
+                              <w:jc w:val="both"/>
+                              <w:rPr>
+                                <w:rFonts w:asciiTheme="majorBidi" w:hAnsiTheme="majorBidi" w:cstheme="majorBidi"/>
+                                <w:sz w:val="28"/>
+                                <w:szCs w:val="28"/>
+                              </w:rPr>
+                            </w:pPr>
+                            <w:r>
+                              <w:rPr>
+                                <w:rFonts w:asciiTheme="majorBidi" w:hAnsiTheme="majorBidi" w:cstheme="majorBidi"/>
+                                <w:b/>
+                                <w:bCs/>
+                                <w:sz w:val="28"/>
+                                <w:szCs w:val="28"/>
+                              </w:rPr>
+                              <w:t xml:space="preserve">Predictable </w:t>
+                            </w:r>
+                            <w:proofErr w:type="spellStart"/>
+                            <w:r>
+                              <w:rPr>
+                                <w:rFonts w:asciiTheme="majorBidi" w:hAnsiTheme="majorBidi" w:cstheme="majorBidi"/>
+                                <w:b/>
+                                <w:bCs/>
+                                <w:sz w:val="28"/>
+                                <w:szCs w:val="28"/>
+                              </w:rPr>
+                              <w:t>behaviour</w:t>
+                            </w:r>
+                            <w:proofErr w:type="spellEnd"/>
+                            <w:r>
+                              <w:rPr>
+                                <w:rFonts w:asciiTheme="majorBidi" w:hAnsiTheme="majorBidi" w:cstheme="majorBidi"/>
+                                <w:sz w:val="28"/>
+                                <w:szCs w:val="28"/>
+                              </w:rPr>
+                              <w:t xml:space="preserve"> → Both environments are identical except for the version being tested.</w:t>
+                            </w:r>
+                          </w:p>
+                          <w:p>
+                            <w:pPr>
+                              <w:spacing w:after="0"/>
+                              <w:jc w:val="both"/>
+                              <w:rPr>
+                                <w:rFonts w:asciiTheme="majorBidi" w:hAnsiTheme="majorBidi" w:cstheme="majorBidi"/>
+                                <w:b/>
+                                <w:bCs/>
+                                <w:sz w:val="28"/>
+                                <w:szCs w:val="28"/>
+                              </w:rPr>
+                            </w:pPr>
+                            <w:r>
+                              <w:rPr>
+                                <w:rFonts w:asciiTheme="majorBidi" w:hAnsiTheme="majorBidi" w:cstheme="majorBidi"/>
+                                <w:b/>
+                                <w:bCs/>
+                                <w:sz w:val="28"/>
+                                <w:szCs w:val="28"/>
+                              </w:rPr>
+                              <w:t>Disadvantages &amp; Considerations</w:t>
+                            </w:r>
+                          </w:p>
+                          <w:p>
+                            <w:pPr>
+                              <w:pStyle w:val="ListParagraph"/>
+                              <w:numPr>
+                                <w:ilvl w:val="0"/>
+                                <w:numId w:val="77"/>
+                              </w:numPr>
+                              <w:ind w:left="360"/>
+                              <w:jc w:val="both"/>
+                              <w:rPr>
+                                <w:rFonts w:asciiTheme="majorBidi" w:hAnsiTheme="majorBidi" w:cstheme="majorBidi"/>
+                                <w:sz w:val="28"/>
+                                <w:szCs w:val="28"/>
+                              </w:rPr>
+                            </w:pPr>
+                            <w:r>
+                              <w:rPr>
+                                <w:rFonts w:asciiTheme="majorBidi" w:hAnsiTheme="majorBidi" w:cstheme="majorBidi"/>
+                                <w:b/>
+                                <w:bCs/>
+                                <w:sz w:val="28"/>
+                                <w:szCs w:val="28"/>
+                              </w:rPr>
+                              <w:t>Higher resource usage</w:t>
+                            </w:r>
+                            <w:r>
+                              <w:rPr>
+                                <w:rFonts w:asciiTheme="majorBidi" w:hAnsiTheme="majorBidi" w:cstheme="majorBidi"/>
+                                <w:sz w:val="28"/>
+                                <w:szCs w:val="28"/>
+                              </w:rPr>
+                              <w:t xml:space="preserve"> → Requires two full environments (double Pods, volumes, etc.).</w:t>
                             </w:r>
                           </w:p>
                           <w:p>
@@ -13138,7 +13548,7 @@
           </mc:Choice>
           <mc:Fallback>
             <w:pict>
-              <v:rect w14:anchorId="06D43647" id="Rectangle 21" o:spid="_x0000_s1034" style="position:absolute;left:0;text-align:left;margin-left:0;margin-top:.6pt;width:539.4pt;height:717pt;z-index:251679744;visibility:visible;mso-wrap-style:square;mso-width-percent:0;mso-height-percent:0;mso-wrap-distance-left:9pt;mso-wrap-distance-top:0;mso-wrap-distance-right:9pt;mso-wrap-distance-bottom:0;mso-position-horizontal:left;mso-position-horizontal-relative:margin;mso-position-vertical:absolute;mso-position-vertical-relative:text;mso-width-percent:0;mso-height-percent:0;mso-width-relative:margin;mso-height-relative:margin;v-text-anchor:middle" o:gfxdata="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" fillcolor="#555 [2160]" strokecolor="black [3200]" strokeweight=".5pt">
+              <v:rect w14:anchorId="06D43647" id="Rectangle 21" o:spid="_x0000_s1035" style="position:absolute;left:0;text-align:left;margin-left:488.2pt;margin-top:.8pt;width:539.4pt;height:717pt;z-index:251679744;visibility:visible;mso-wrap-style:square;mso-width-percent:0;mso-height-percent:0;mso-wrap-distance-left:9pt;mso-wrap-distance-top:0;mso-wrap-distance-right:9pt;mso-wrap-distance-bottom:0;mso-position-horizontal:right;mso-position-horizontal-relative:margin;mso-position-vertical:absolute;mso-position-vertical-relative:text;mso-width-percent:0;mso-height-percent:0;mso-width-relative:margin;mso-height-relative:margin;v-text-anchor:middle" o:gfxdata="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" fillcolor="#555 [2160]" strokecolor="black [3200]" strokeweight=".5pt">
                 <v:fill color2="#313131 [2608]" rotate="t" colors="0 #9b9b9b;.5 #8e8e8e;1 #797979" focus="100%" type="gradient">
                   <o:fill v:ext="view" type="gradientUnscaled"/>
                 </v:fill>
@@ -13146,65 +13556,7 @@
                   <w:txbxContent>
                     <w:p>
                       <w:pPr>
-                        <w:spacing w:after="60"/>
-                        <w:jc w:val="both"/>
-                        <w:rPr>
-                          <w:rFonts w:asciiTheme="majorBidi" w:hAnsiTheme="majorBidi" w:cstheme="majorBidi"/>
-                          <w:b/>
-                          <w:bCs/>
-                          <w:sz w:val="36"/>
-                          <w:szCs w:val="36"/>
-                        </w:rPr>
-                      </w:pPr>
-                      <w:r>
-                        <w:rPr>
-                          <w:rFonts w:asciiTheme="majorBidi" w:hAnsiTheme="majorBidi" w:cstheme="majorBidi"/>
-                          <w:b/>
-                          <w:bCs/>
-                          <w:sz w:val="36"/>
-                          <w:szCs w:val="36"/>
-                        </w:rPr>
-                        <w:t>Blue‑Green Deployment</w:t>
-                      </w:r>
-                    </w:p>
-                    <w:p>
-                      <w:pPr>
-                        <w:spacing w:after="120"/>
-                        <w:jc w:val="both"/>
-                        <w:rPr>
-                          <w:rFonts w:asciiTheme="majorBidi" w:hAnsiTheme="majorBidi" w:cstheme="majorBidi"/>
-                          <w:sz w:val="28"/>
-                          <w:szCs w:val="28"/>
-                        </w:rPr>
-                      </w:pPr>
-                      <w:r>
-                        <w:rPr>
-                          <w:rFonts w:asciiTheme="majorBidi" w:hAnsiTheme="majorBidi" w:cstheme="majorBidi"/>
-                          <w:sz w:val="28"/>
-                          <w:szCs w:val="28"/>
-                        </w:rPr>
-                        <w:t>Blue‑Green deployment is a release strategy for updating applications with zero downtime and instant rollback capability.</w:t>
-                      </w:r>
-                      <w:r>
-                        <w:rPr>
-                          <w:rFonts w:asciiTheme="majorBidi" w:hAnsiTheme="majorBidi" w:cstheme="majorBidi"/>
-                          <w:sz w:val="28"/>
-                          <w:szCs w:val="28"/>
-                        </w:rPr>
-                        <w:t xml:space="preserve"> </w:t>
-                      </w:r>
-                      <w:r>
-                        <w:rPr>
-                          <w:rFonts w:asciiTheme="majorBidi" w:hAnsiTheme="majorBidi" w:cstheme="majorBidi"/>
-                          <w:sz w:val="28"/>
-                          <w:szCs w:val="28"/>
-                        </w:rPr>
-                        <w:t>It works by running two identical environments called Blue and Green and switching traffic between them.</w:t>
-                      </w:r>
-                    </w:p>
-                    <w:p>
-                      <w:pPr>
-                        <w:spacing w:after="60"/>
+                        <w:spacing w:after="0"/>
                         <w:jc w:val="both"/>
                         <w:rPr>
                           <w:rFonts w:asciiTheme="majorBidi" w:hAnsiTheme="majorBidi" w:cstheme="majorBidi"/>
@@ -13257,7 +13609,7 @@
                           <w:ilvl w:val="0"/>
                           <w:numId w:val="73"/>
                         </w:numPr>
-                        <w:spacing w:after="60"/>
+                        <w:spacing w:after="0"/>
                         <w:ind w:left="360"/>
                         <w:jc w:val="both"/>
                         <w:rPr>
@@ -13339,15 +13691,15 @@
                           <w:sz w:val="28"/>
                           <w:szCs w:val="28"/>
                         </w:rPr>
-                        <w:t xml:space="preserve">If something goes wrong, you can switch traffic back to Blue just as quickly </w:t>
-                      </w:r>
-                      <w:r>
-                        <w:rPr>
-                          <w:rFonts w:asciiTheme="majorBidi" w:hAnsiTheme="majorBidi" w:cstheme="majorBidi"/>
-                          <w:sz w:val="28"/>
-                          <w:szCs w:val="28"/>
-                        </w:rPr>
-                        <w:t>-</w:t>
+                        <w:t>If something goes wrong, you can switch traffic back to Blue just as quickly</w:t>
+                      </w:r>
+                      <w:r>
+                        <w:rPr>
+                          <w:rFonts w:asciiTheme="majorBidi" w:hAnsiTheme="majorBidi" w:cstheme="majorBidi"/>
+                          <w:sz w:val="28"/>
+                          <w:szCs w:val="28"/>
+                        </w:rPr>
+                        <w:t>.</w:t>
                       </w:r>
                       <w:r>
                         <w:rPr>
@@ -13716,7 +14068,7 @@
                           <w:ilvl w:val="0"/>
                           <w:numId w:val="74"/>
                         </w:numPr>
-                        <w:spacing w:after="120"/>
+                        <w:spacing w:after="60"/>
                         <w:ind w:left="360"/>
                         <w:jc w:val="both"/>
                         <w:rPr>
@@ -13768,6 +14120,39 @@
                           <w:szCs w:val="28"/>
                         </w:rPr>
                         <w:t xml:space="preserve"> environment or prepare it for the next version.</w:t>
+                      </w:r>
+                    </w:p>
+                    <w:p>
+                      <w:pPr>
+                        <w:spacing w:after="0"/>
+                        <w:jc w:val="both"/>
+                        <w:rPr>
+                          <w:rFonts w:asciiTheme="majorBidi" w:hAnsiTheme="majorBidi" w:cstheme="majorBidi"/>
+                          <w:b/>
+                          <w:bCs/>
+                          <w:sz w:val="32"/>
+                          <w:szCs w:val="32"/>
+                        </w:rPr>
+                      </w:pPr>
+                      <w:r>
+                        <w:rPr>
+                          <w:rFonts w:asciiTheme="majorBidi" w:hAnsiTheme="majorBidi" w:cstheme="majorBidi"/>
+                          <w:b/>
+                          <w:bCs/>
+                          <w:sz w:val="32"/>
+                          <w:szCs w:val="32"/>
+                        </w:rPr>
+                        <w:t>Blue‑Green in Kubernetes</w:t>
+                      </w:r>
+                      <w:r>
+                        <w:rPr>
+                          <w:rFonts w:asciiTheme="majorBidi" w:hAnsiTheme="majorBidi" w:cstheme="majorBidi"/>
+                          <w:b/>
+                          <w:bCs/>
+                          <w:sz w:val="32"/>
+                          <w:szCs w:val="32"/>
+                        </w:rPr>
+                        <w:t>:</w:t>
                       </w:r>
                     </w:p>
                     <w:p>
@@ -13776,31 +14161,56 @@
                         <w:jc w:val="both"/>
                         <w:rPr>
                           <w:rFonts w:asciiTheme="majorBidi" w:hAnsiTheme="majorBidi" w:cstheme="majorBidi"/>
+                          <w:sz w:val="28"/>
+                          <w:szCs w:val="28"/>
+                        </w:rPr>
+                      </w:pPr>
+                      <w:r>
+                        <w:rPr>
+                          <w:rFonts w:asciiTheme="majorBidi" w:hAnsiTheme="majorBidi" w:cstheme="majorBidi"/>
+                          <w:sz w:val="28"/>
+                          <w:szCs w:val="28"/>
+                        </w:rPr>
+                        <w:t>In Kubernetes, Blue‑Green can be implemented with two Deployments and one Service.</w:t>
+                      </w:r>
+                    </w:p>
+                    <w:p>
+                      <w:pPr>
+                        <w:spacing w:after="0"/>
+                        <w:jc w:val="both"/>
+                        <w:rPr>
+                          <w:rFonts w:asciiTheme="majorBidi" w:hAnsiTheme="majorBidi" w:cstheme="majorBidi"/>
+                          <w:sz w:val="28"/>
+                          <w:szCs w:val="28"/>
+                        </w:rPr>
+                      </w:pPr>
+                      <w:r>
+                        <w:rPr>
+                          <w:rFonts w:asciiTheme="majorBidi" w:hAnsiTheme="majorBidi" w:cstheme="majorBidi"/>
+                          <w:sz w:val="28"/>
+                          <w:szCs w:val="28"/>
+                        </w:rPr>
+                        <w:t xml:space="preserve">Initially, the Service selector points to </w:t>
+                      </w:r>
+                      <w:r>
+                        <w:rPr>
+                          <w:rFonts w:asciiTheme="majorBidi" w:hAnsiTheme="majorBidi" w:cstheme="majorBidi"/>
                           <w:b/>
                           <w:bCs/>
-                          <w:sz w:val="32"/>
-                          <w:szCs w:val="32"/>
-                        </w:rPr>
-                      </w:pPr>
-                      <w:r>
-                        <w:rPr>
-                          <w:rFonts w:asciiTheme="majorBidi" w:hAnsiTheme="majorBidi" w:cstheme="majorBidi"/>
-                          <w:b/>
-                          <w:bCs/>
-                          <w:sz w:val="32"/>
-                          <w:szCs w:val="32"/>
-                        </w:rPr>
-                        <w:t>Blue‑Green in Kubernetes</w:t>
-                      </w:r>
-                      <w:r>
-                        <w:rPr>
-                          <w:rFonts w:asciiTheme="majorBidi" w:hAnsiTheme="majorBidi" w:cstheme="majorBidi"/>
-                          <w:b/>
-                          <w:bCs/>
-                          <w:sz w:val="32"/>
-                          <w:szCs w:val="32"/>
-                        </w:rPr>
-                        <w:t>:</w:t>
+                          <w:i/>
+                          <w:iCs/>
+                          <w:sz w:val="28"/>
+                          <w:szCs w:val="28"/>
+                        </w:rPr>
+                        <w:t>version: blue</w:t>
+                      </w:r>
+                      <w:r>
+                        <w:rPr>
+                          <w:rFonts w:asciiTheme="majorBidi" w:hAnsiTheme="majorBidi" w:cstheme="majorBidi"/>
+                          <w:sz w:val="28"/>
+                          <w:szCs w:val="28"/>
+                        </w:rPr>
+                        <w:t>.</w:t>
                       </w:r>
                     </w:p>
                     <w:p>
@@ -13819,7 +14229,64 @@
                           <w:sz w:val="28"/>
                           <w:szCs w:val="28"/>
                         </w:rPr>
-                        <w:t>In Kubernetes, Blue‑Green can be implemented with two Deployments and one Service.</w:t>
+                        <w:t xml:space="preserve">When you’re ready to release, you simply update the Service selector to </w:t>
+                      </w:r>
+                      <w:r>
+                        <w:rPr>
+                          <w:rFonts w:asciiTheme="majorBidi" w:hAnsiTheme="majorBidi" w:cstheme="majorBidi"/>
+                          <w:b/>
+                          <w:bCs/>
+                          <w:i/>
+                          <w:iCs/>
+                          <w:sz w:val="28"/>
+                          <w:szCs w:val="28"/>
+                        </w:rPr>
+                        <w:t>version: green</w:t>
+                      </w:r>
+                      <w:r>
+                        <w:rPr>
+                          <w:rFonts w:asciiTheme="majorBidi" w:hAnsiTheme="majorBidi" w:cstheme="majorBidi"/>
+                          <w:sz w:val="28"/>
+                          <w:szCs w:val="28"/>
+                        </w:rPr>
+                        <w:t>.</w:t>
+                      </w:r>
+                    </w:p>
+                    <w:p>
+                      <w:pPr>
+                        <w:spacing w:after="0"/>
+                        <w:jc w:val="both"/>
+                        <w:rPr>
+                          <w:rFonts w:asciiTheme="majorBidi" w:hAnsiTheme="majorBidi" w:cstheme="majorBidi"/>
+                          <w:sz w:val="28"/>
+                          <w:szCs w:val="28"/>
+                        </w:rPr>
+                      </w:pPr>
+                      <w:r>
+                        <w:rPr>
+                          <w:rFonts w:asciiTheme="majorBidi" w:hAnsiTheme="majorBidi" w:cstheme="majorBidi"/>
+                          <w:sz w:val="28"/>
+                          <w:szCs w:val="28"/>
+                        </w:rPr>
+                        <w:t xml:space="preserve">That instantly transfers all traffic to the </w:t>
+                      </w:r>
+                      <w:proofErr w:type="gramStart"/>
+                      <w:r>
+                        <w:rPr>
+                          <w:rFonts w:asciiTheme="majorBidi" w:hAnsiTheme="majorBidi" w:cstheme="majorBidi"/>
+                          <w:sz w:val="28"/>
+                          <w:szCs w:val="28"/>
+                        </w:rPr>
+                        <w:t>Green</w:t>
+                      </w:r>
+                      <w:proofErr w:type="gramEnd"/>
+                      <w:r>
+                        <w:rPr>
+                          <w:rFonts w:asciiTheme="majorBidi" w:hAnsiTheme="majorBidi" w:cstheme="majorBidi"/>
+                          <w:sz w:val="28"/>
+                          <w:szCs w:val="28"/>
+                        </w:rPr>
+                        <w:t xml:space="preserve"> pods.</w:t>
                       </w:r>
                     </w:p>
                     <w:p>
@@ -13838,127 +14305,12 @@
                           <w:sz w:val="28"/>
                           <w:szCs w:val="28"/>
                         </w:rPr>
-                        <w:t xml:space="preserve">Initially, the Service selector points to </w:t>
-                      </w:r>
-                      <w:r>
-                        <w:rPr>
-                          <w:rFonts w:asciiTheme="majorBidi" w:hAnsiTheme="majorBidi" w:cstheme="majorBidi"/>
-                          <w:b/>
-                          <w:bCs/>
-                          <w:i/>
-                          <w:iCs/>
-                          <w:sz w:val="28"/>
-                          <w:szCs w:val="28"/>
-                        </w:rPr>
-                        <w:t>version: blue</w:t>
-                      </w:r>
-                      <w:r>
-                        <w:rPr>
-                          <w:rFonts w:asciiTheme="majorBidi" w:hAnsiTheme="majorBidi" w:cstheme="majorBidi"/>
-                          <w:sz w:val="28"/>
-                          <w:szCs w:val="28"/>
-                        </w:rPr>
-                        <w:t>.</w:t>
+                        <w:t>If there’s an issue → change it back to version: blue.</w:t>
                       </w:r>
                     </w:p>
                     <w:p>
                       <w:pPr>
-                        <w:spacing w:after="60"/>
-                        <w:jc w:val="both"/>
-                        <w:rPr>
-                          <w:rFonts w:asciiTheme="majorBidi" w:hAnsiTheme="majorBidi" w:cstheme="majorBidi"/>
-                          <w:sz w:val="28"/>
-                          <w:szCs w:val="28"/>
-                        </w:rPr>
-                      </w:pPr>
-                      <w:r>
-                        <w:rPr>
-                          <w:rFonts w:asciiTheme="majorBidi" w:hAnsiTheme="majorBidi" w:cstheme="majorBidi"/>
-                          <w:sz w:val="28"/>
-                          <w:szCs w:val="28"/>
-                        </w:rPr>
-                        <w:t xml:space="preserve">When you’re ready to release, you simply update the Service selector to </w:t>
-                      </w:r>
-                      <w:r>
-                        <w:rPr>
-                          <w:rFonts w:asciiTheme="majorBidi" w:hAnsiTheme="majorBidi" w:cstheme="majorBidi"/>
-                          <w:b/>
-                          <w:bCs/>
-                          <w:i/>
-                          <w:iCs/>
-                          <w:sz w:val="28"/>
-                          <w:szCs w:val="28"/>
-                        </w:rPr>
-                        <w:t>version: green</w:t>
-                      </w:r>
-                      <w:r>
-                        <w:rPr>
-                          <w:rFonts w:asciiTheme="majorBidi" w:hAnsiTheme="majorBidi" w:cstheme="majorBidi"/>
-                          <w:sz w:val="28"/>
-                          <w:szCs w:val="28"/>
-                        </w:rPr>
-                        <w:t>.</w:t>
-                      </w:r>
-                    </w:p>
-                    <w:p>
-                      <w:pPr>
-                        <w:spacing w:after="60"/>
-                        <w:jc w:val="both"/>
-                        <w:rPr>
-                          <w:rFonts w:asciiTheme="majorBidi" w:hAnsiTheme="majorBidi" w:cstheme="majorBidi"/>
-                          <w:sz w:val="28"/>
-                          <w:szCs w:val="28"/>
-                        </w:rPr>
-                      </w:pPr>
-                      <w:r>
-                        <w:rPr>
-                          <w:rFonts w:asciiTheme="majorBidi" w:hAnsiTheme="majorBidi" w:cstheme="majorBidi"/>
-                          <w:sz w:val="28"/>
-                          <w:szCs w:val="28"/>
-                        </w:rPr>
-                        <w:t xml:space="preserve">That instantly transfers all traffic to the </w:t>
-                      </w:r>
-                      <w:proofErr w:type="gramStart"/>
-                      <w:r>
-                        <w:rPr>
-                          <w:rFonts w:asciiTheme="majorBidi" w:hAnsiTheme="majorBidi" w:cstheme="majorBidi"/>
-                          <w:sz w:val="28"/>
-                          <w:szCs w:val="28"/>
-                        </w:rPr>
-                        <w:t>Green</w:t>
-                      </w:r>
-                      <w:proofErr w:type="gramEnd"/>
-                      <w:r>
-                        <w:rPr>
-                          <w:rFonts w:asciiTheme="majorBidi" w:hAnsiTheme="majorBidi" w:cstheme="majorBidi"/>
-                          <w:sz w:val="28"/>
-                          <w:szCs w:val="28"/>
-                        </w:rPr>
-                        <w:t xml:space="preserve"> pods.</w:t>
-                      </w:r>
-                    </w:p>
-                    <w:p>
-                      <w:pPr>
-                        <w:spacing w:after="120"/>
-                        <w:jc w:val="both"/>
-                        <w:rPr>
-                          <w:rFonts w:asciiTheme="majorBidi" w:hAnsiTheme="majorBidi" w:cstheme="majorBidi"/>
-                          <w:sz w:val="28"/>
-                          <w:szCs w:val="28"/>
-                        </w:rPr>
-                      </w:pPr>
-                      <w:r>
-                        <w:rPr>
-                          <w:rFonts w:asciiTheme="majorBidi" w:hAnsiTheme="majorBidi" w:cstheme="majorBidi"/>
-                          <w:sz w:val="28"/>
-                          <w:szCs w:val="28"/>
-                        </w:rPr>
-                        <w:t>If there’s an issue → change it back to version: blue.</w:t>
-                      </w:r>
-                    </w:p>
-                    <w:p>
-                      <w:pPr>
-                        <w:spacing w:after="120"/>
+                        <w:spacing w:after="0"/>
                         <w:jc w:val="both"/>
                         <w:rPr>
                           <w:rFonts w:asciiTheme="majorBidi" w:hAnsiTheme="majorBidi" w:cstheme="majorBidi"/>
@@ -14007,10 +14359,20 @@
                       <w:r>
                         <w:rPr>
                           <w:rFonts w:asciiTheme="majorBidi" w:hAnsiTheme="majorBidi" w:cstheme="majorBidi"/>
-                          <w:sz w:val="28"/>
-                          <w:szCs w:val="28"/>
-                        </w:rPr>
-                        <w:t>Zero downtime → Traffic is switched instantly; no overlap of half‑updated Pods.</w:t>
+                          <w:b/>
+                          <w:bCs/>
+                          <w:sz w:val="28"/>
+                          <w:szCs w:val="28"/>
+                        </w:rPr>
+                        <w:t>Zero downtime</w:t>
+                      </w:r>
+                      <w:r>
+                        <w:rPr>
+                          <w:rFonts w:asciiTheme="majorBidi" w:hAnsiTheme="majorBidi" w:cstheme="majorBidi"/>
+                          <w:sz w:val="28"/>
+                          <w:szCs w:val="28"/>
+                        </w:rPr>
+                        <w:t xml:space="preserve"> → Traffic is switched instantly; no overlap of half‑updated Pods.</w:t>
                       </w:r>
                     </w:p>
                     <w:p>
@@ -14031,10 +14393,158 @@
                       <w:r>
                         <w:rPr>
                           <w:rFonts w:asciiTheme="majorBidi" w:hAnsiTheme="majorBidi" w:cstheme="majorBidi"/>
-                          <w:sz w:val="28"/>
-                          <w:szCs w:val="28"/>
-                        </w:rPr>
-                        <w:t>Instant rollback → Just re‑point the Service or load balancer.</w:t>
+                          <w:b/>
+                          <w:bCs/>
+                          <w:sz w:val="28"/>
+                          <w:szCs w:val="28"/>
+                        </w:rPr>
+                        <w:t>Instant rollback</w:t>
+                      </w:r>
+                      <w:r>
+                        <w:rPr>
+                          <w:rFonts w:asciiTheme="majorBidi" w:hAnsiTheme="majorBidi" w:cstheme="majorBidi"/>
+                          <w:sz w:val="28"/>
+                          <w:szCs w:val="28"/>
+                        </w:rPr>
+                        <w:t xml:space="preserve"> → Just re‑point the Service or load balancer.</w:t>
+                      </w:r>
+                    </w:p>
+                    <w:p>
+                      <w:pPr>
+                        <w:pStyle w:val="ListParagraph"/>
+                        <w:numPr>
+                          <w:ilvl w:val="0"/>
+                          <w:numId w:val="76"/>
+                        </w:numPr>
+                        <w:ind w:left="360"/>
+                        <w:jc w:val="both"/>
+                        <w:rPr>
+                          <w:rFonts w:asciiTheme="majorBidi" w:hAnsiTheme="majorBidi" w:cstheme="majorBidi"/>
+                          <w:sz w:val="28"/>
+                          <w:szCs w:val="28"/>
+                        </w:rPr>
+                      </w:pPr>
+                      <w:r>
+                        <w:rPr>
+                          <w:rFonts w:asciiTheme="majorBidi" w:hAnsiTheme="majorBidi" w:cstheme="majorBidi"/>
+                          <w:b/>
+                          <w:bCs/>
+                          <w:sz w:val="28"/>
+                          <w:szCs w:val="28"/>
+                        </w:rPr>
+                        <w:t>Safe testing</w:t>
+                      </w:r>
+                      <w:r>
+                        <w:rPr>
+                          <w:rFonts w:asciiTheme="majorBidi" w:hAnsiTheme="majorBidi" w:cstheme="majorBidi"/>
+                          <w:sz w:val="28"/>
+                          <w:szCs w:val="28"/>
+                        </w:rPr>
+                        <w:t xml:space="preserve"> → The Green environment runs side‑by‑side - can be validated before serving users.</w:t>
+                      </w:r>
+                    </w:p>
+                    <w:p>
+                      <w:pPr>
+                        <w:pStyle w:val="ListParagraph"/>
+                        <w:numPr>
+                          <w:ilvl w:val="0"/>
+                          <w:numId w:val="76"/>
+                        </w:numPr>
+                        <w:spacing w:after="60"/>
+                        <w:ind w:left="360"/>
+                        <w:jc w:val="both"/>
+                        <w:rPr>
+                          <w:rFonts w:asciiTheme="majorBidi" w:hAnsiTheme="majorBidi" w:cstheme="majorBidi"/>
+                          <w:sz w:val="28"/>
+                          <w:szCs w:val="28"/>
+                        </w:rPr>
+                      </w:pPr>
+                      <w:r>
+                        <w:rPr>
+                          <w:rFonts w:asciiTheme="majorBidi" w:hAnsiTheme="majorBidi" w:cstheme="majorBidi"/>
+                          <w:b/>
+                          <w:bCs/>
+                          <w:sz w:val="28"/>
+                          <w:szCs w:val="28"/>
+                        </w:rPr>
+                        <w:t xml:space="preserve">Predictable </w:t>
+                      </w:r>
+                      <w:proofErr w:type="spellStart"/>
+                      <w:r>
+                        <w:rPr>
+                          <w:rFonts w:asciiTheme="majorBidi" w:hAnsiTheme="majorBidi" w:cstheme="majorBidi"/>
+                          <w:b/>
+                          <w:bCs/>
+                          <w:sz w:val="28"/>
+                          <w:szCs w:val="28"/>
+                        </w:rPr>
+                        <w:t>behaviour</w:t>
+                      </w:r>
+                      <w:proofErr w:type="spellEnd"/>
+                      <w:r>
+                        <w:rPr>
+                          <w:rFonts w:asciiTheme="majorBidi" w:hAnsiTheme="majorBidi" w:cstheme="majorBidi"/>
+                          <w:sz w:val="28"/>
+                          <w:szCs w:val="28"/>
+                        </w:rPr>
+                        <w:t xml:space="preserve"> → Both environments are identical except for the version being tested.</w:t>
+                      </w:r>
+                    </w:p>
+                    <w:p>
+                      <w:pPr>
+                        <w:spacing w:after="0"/>
+                        <w:jc w:val="both"/>
+                        <w:rPr>
+                          <w:rFonts w:asciiTheme="majorBidi" w:hAnsiTheme="majorBidi" w:cstheme="majorBidi"/>
+                          <w:b/>
+                          <w:bCs/>
+                          <w:sz w:val="28"/>
+                          <w:szCs w:val="28"/>
+                        </w:rPr>
+                      </w:pPr>
+                      <w:r>
+                        <w:rPr>
+                          <w:rFonts w:asciiTheme="majorBidi" w:hAnsiTheme="majorBidi" w:cstheme="majorBidi"/>
+                          <w:b/>
+                          <w:bCs/>
+                          <w:sz w:val="28"/>
+                          <w:szCs w:val="28"/>
+                        </w:rPr>
+                        <w:t>Disadvantages &amp; Considerations</w:t>
+                      </w:r>
+                    </w:p>
+                    <w:p>
+                      <w:pPr>
+                        <w:pStyle w:val="ListParagraph"/>
+                        <w:numPr>
+                          <w:ilvl w:val="0"/>
+                          <w:numId w:val="77"/>
+                        </w:numPr>
+                        <w:ind w:left="360"/>
+                        <w:jc w:val="both"/>
+                        <w:rPr>
+                          <w:rFonts w:asciiTheme="majorBidi" w:hAnsiTheme="majorBidi" w:cstheme="majorBidi"/>
+                          <w:sz w:val="28"/>
+                          <w:szCs w:val="28"/>
+                        </w:rPr>
+                      </w:pPr>
+                      <w:r>
+                        <w:rPr>
+                          <w:rFonts w:asciiTheme="majorBidi" w:hAnsiTheme="majorBidi" w:cstheme="majorBidi"/>
+                          <w:b/>
+                          <w:bCs/>
+                          <w:sz w:val="28"/>
+                          <w:szCs w:val="28"/>
+                        </w:rPr>
+                        <w:t>Higher resource usage</w:t>
+                      </w:r>
+                      <w:r>
+                        <w:rPr>
+                          <w:rFonts w:asciiTheme="majorBidi" w:hAnsiTheme="majorBidi" w:cstheme="majorBidi"/>
+                          <w:sz w:val="28"/>
+                          <w:szCs w:val="28"/>
+                        </w:rPr>
+                        <w:t xml:space="preserve"> → Requires two full environments (double Pods, volumes, etc.).</w:t>
                       </w:r>
                     </w:p>
                     <w:p>
@@ -14372,16 +14882,16 @@
         <mc:AlternateContent>
           <mc:Choice Requires="wps">
             <w:drawing>
-              <wp:anchor distT="0" distB="0" distL="114300" distR="114300" simplePos="0" relativeHeight="251681792" behindDoc="0" locked="0" layoutInCell="1" allowOverlap="1" wp14:anchorId="2DD4B9FD" wp14:editId="62F25068">
+              <wp:anchor distT="0" distB="0" distL="114300" distR="114300" simplePos="0" relativeHeight="251681792" behindDoc="0" locked="0" layoutInCell="1" allowOverlap="1" wp14:anchorId="2DD4B9FD" wp14:editId="578F0BD4">
                 <wp:simplePos x="0" y="0"/>
                 <wp:positionH relativeFrom="margin">
                   <wp:align>right</wp:align>
                 </wp:positionH>
                 <wp:positionV relativeFrom="paragraph">
-                  <wp:posOffset>7620</wp:posOffset>
+                  <wp:posOffset>-1270</wp:posOffset>
                 </wp:positionV>
-                <wp:extent cx="6835140" cy="7467600"/>
-                <wp:effectExtent l="0" t="0" r="22860" b="19050"/>
+                <wp:extent cx="6835140" cy="5745480"/>
+                <wp:effectExtent l="0" t="0" r="22860" b="26670"/>
                 <wp:wrapNone/>
                 <wp:docPr id="1946883900" name="Rectangle 21"/>
                 <wp:cNvGraphicFramePr/>
@@ -14392,7 +14902,7 @@
                       <wps:spPr>
                         <a:xfrm>
                           <a:off x="0" y="0"/>
-                          <a:ext cx="6835140" cy="7467600"/>
+                          <a:ext cx="6835140" cy="5745480"/>
                         </a:xfrm>
                         <a:prstGeom prst="rect">
                           <a:avLst/>
@@ -14419,7 +14929,7 @@
                               <w:pStyle w:val="ListParagraph"/>
                               <w:numPr>
                                 <w:ilvl w:val="0"/>
-                                <w:numId w:val="76"/>
+                                <w:numId w:val="77"/>
                               </w:numPr>
                               <w:ind w:left="360"/>
                               <w:jc w:val="both"/>
@@ -14432,35 +14942,20 @@
                             <w:r>
                               <w:rPr>
                                 <w:rFonts w:asciiTheme="majorBidi" w:hAnsiTheme="majorBidi" w:cstheme="majorBidi"/>
-                                <w:sz w:val="28"/>
-                                <w:szCs w:val="28"/>
-                              </w:rPr>
-                              <w:t>Safe testing → The Green environment runs side‑by‑side - can be validated before serving users.</w:t>
-                            </w:r>
-                          </w:p>
-                          <w:p>
-                            <w:pPr>
-                              <w:pStyle w:val="ListParagraph"/>
-                              <w:numPr>
-                                <w:ilvl w:val="0"/>
-                                <w:numId w:val="76"/>
-                              </w:numPr>
-                              <w:spacing w:after="120"/>
-                              <w:ind w:left="360"/>
-                              <w:jc w:val="both"/>
-                              <w:rPr>
-                                <w:rFonts w:asciiTheme="majorBidi" w:hAnsiTheme="majorBidi" w:cstheme="majorBidi"/>
-                                <w:sz w:val="28"/>
-                                <w:szCs w:val="28"/>
-                              </w:rPr>
-                            </w:pPr>
-                            <w:r>
-                              <w:rPr>
-                                <w:rFonts w:asciiTheme="majorBidi" w:hAnsiTheme="majorBidi" w:cstheme="majorBidi"/>
-                                <w:sz w:val="28"/>
-                                <w:szCs w:val="28"/>
-                              </w:rPr>
-                              <w:t xml:space="preserve">Predictable </w:t>
+                                <w:b/>
+                                <w:bCs/>
+                                <w:sz w:val="28"/>
+                                <w:szCs w:val="28"/>
+                              </w:rPr>
+                              <w:t>Stateful complications</w:t>
+                            </w:r>
+                            <w:r>
+                              <w:rPr>
+                                <w:rFonts w:asciiTheme="majorBidi" w:hAnsiTheme="majorBidi" w:cstheme="majorBidi"/>
+                                <w:sz w:val="28"/>
+                                <w:szCs w:val="28"/>
+                              </w:rPr>
+                              <w:t xml:space="preserve"> → For databases and </w:t>
                             </w:r>
                             <w:proofErr w:type="spellStart"/>
                             <w:r>
@@ -14469,7 +14964,7 @@
                                 <w:sz w:val="28"/>
                                 <w:szCs w:val="28"/>
                               </w:rPr>
-                              <w:t>behaviour</w:t>
+                              <w:t>StatefulSets</w:t>
                             </w:r>
                             <w:proofErr w:type="spellEnd"/>
                             <w:r>
@@ -14478,30 +14973,7 @@
                                 <w:sz w:val="28"/>
                                 <w:szCs w:val="28"/>
                               </w:rPr>
-                              <w:t xml:space="preserve"> → Both environments are identical except for the version being tested.</w:t>
-                            </w:r>
-                          </w:p>
-                          <w:p>
-                            <w:pPr>
-                              <w:spacing w:after="60"/>
-                              <w:jc w:val="both"/>
-                              <w:rPr>
-                                <w:rFonts w:asciiTheme="majorBidi" w:hAnsiTheme="majorBidi" w:cstheme="majorBidi"/>
-                                <w:b/>
-                                <w:bCs/>
-                                <w:sz w:val="28"/>
-                                <w:szCs w:val="28"/>
-                              </w:rPr>
-                            </w:pPr>
-                            <w:r>
-                              <w:rPr>
-                                <w:rFonts w:asciiTheme="majorBidi" w:hAnsiTheme="majorBidi" w:cstheme="majorBidi"/>
-                                <w:b/>
-                                <w:bCs/>
-                                <w:sz w:val="28"/>
-                                <w:szCs w:val="28"/>
-                              </w:rPr>
-                              <w:t>Disadvantages &amp; Considerations</w:t>
+                              <w:t>, data consistency between Blue and Green needs to be managed carefully.</w:t>
                             </w:r>
                           </w:p>
                           <w:p>
@@ -14511,6 +14983,7 @@
                                 <w:ilvl w:val="0"/>
                                 <w:numId w:val="77"/>
                               </w:numPr>
+                              <w:spacing w:after="120"/>
                               <w:ind w:left="360"/>
                               <w:jc w:val="both"/>
                               <w:rPr>
@@ -14522,76 +14995,20 @@
                             <w:r>
                               <w:rPr>
                                 <w:rFonts w:asciiTheme="majorBidi" w:hAnsiTheme="majorBidi" w:cstheme="majorBidi"/>
-                                <w:sz w:val="28"/>
-                                <w:szCs w:val="28"/>
-                              </w:rPr>
-                              <w:t>Higher resource usage → Requires two full environments (double Pods, volumes, etc.).</w:t>
-                            </w:r>
-                          </w:p>
-                          <w:p>
-                            <w:pPr>
-                              <w:pStyle w:val="ListParagraph"/>
-                              <w:numPr>
-                                <w:ilvl w:val="0"/>
-                                <w:numId w:val="77"/>
-                              </w:numPr>
-                              <w:ind w:left="360"/>
-                              <w:jc w:val="both"/>
-                              <w:rPr>
-                                <w:rFonts w:asciiTheme="majorBidi" w:hAnsiTheme="majorBidi" w:cstheme="majorBidi"/>
-                                <w:sz w:val="28"/>
-                                <w:szCs w:val="28"/>
-                              </w:rPr>
-                            </w:pPr>
-                            <w:r>
-                              <w:rPr>
-                                <w:rFonts w:asciiTheme="majorBidi" w:hAnsiTheme="majorBidi" w:cstheme="majorBidi"/>
-                                <w:sz w:val="28"/>
-                                <w:szCs w:val="28"/>
-                              </w:rPr>
-                              <w:t xml:space="preserve">Stateful complications → For databases and </w:t>
-                            </w:r>
-                            <w:proofErr w:type="spellStart"/>
-                            <w:r>
-                              <w:rPr>
-                                <w:rFonts w:asciiTheme="majorBidi" w:hAnsiTheme="majorBidi" w:cstheme="majorBidi"/>
-                                <w:sz w:val="28"/>
-                                <w:szCs w:val="28"/>
-                              </w:rPr>
-                              <w:t>StatefulSets</w:t>
-                            </w:r>
-                            <w:proofErr w:type="spellEnd"/>
-                            <w:r>
-                              <w:rPr>
-                                <w:rFonts w:asciiTheme="majorBidi" w:hAnsiTheme="majorBidi" w:cstheme="majorBidi"/>
-                                <w:sz w:val="28"/>
-                                <w:szCs w:val="28"/>
-                              </w:rPr>
-                              <w:t>, data consistency between Blue and Green needs to be managed carefully.</w:t>
-                            </w:r>
-                          </w:p>
-                          <w:p>
-                            <w:pPr>
-                              <w:pStyle w:val="ListParagraph"/>
-                              <w:numPr>
-                                <w:ilvl w:val="0"/>
-                                <w:numId w:val="77"/>
-                              </w:numPr>
-                              <w:ind w:left="360"/>
-                              <w:jc w:val="both"/>
-                              <w:rPr>
-                                <w:rFonts w:asciiTheme="majorBidi" w:hAnsiTheme="majorBidi" w:cstheme="majorBidi"/>
-                                <w:sz w:val="28"/>
-                                <w:szCs w:val="28"/>
-                              </w:rPr>
-                            </w:pPr>
-                            <w:r>
-                              <w:rPr>
-                                <w:rFonts w:asciiTheme="majorBidi" w:hAnsiTheme="majorBidi" w:cstheme="majorBidi"/>
-                                <w:sz w:val="28"/>
-                                <w:szCs w:val="28"/>
-                              </w:rPr>
-                              <w:t>Network caching or connection drain → Long‑lived connections may require extra care to drain old traffic gracefully.</w:t>
+                                <w:b/>
+                                <w:bCs/>
+                                <w:sz w:val="28"/>
+                                <w:szCs w:val="28"/>
+                              </w:rPr>
+                              <w:t>Network caching or connection drain</w:t>
+                            </w:r>
+                            <w:r>
+                              <w:rPr>
+                                <w:rFonts w:asciiTheme="majorBidi" w:hAnsiTheme="majorBidi" w:cstheme="majorBidi"/>
+                                <w:sz w:val="28"/>
+                                <w:szCs w:val="28"/>
+                              </w:rPr>
+                              <w:t xml:space="preserve"> → Long‑lived connections may require extra care to drain old traffic gracefully.</w:t>
                             </w:r>
                           </w:p>
                           <w:p>
@@ -15290,6 +15707,7 @@
                           </w:tbl>
                           <w:p>
                             <w:pPr>
+                              <w:spacing w:after="120"/>
                               <w:rPr>
                                 <w:rFonts w:asciiTheme="majorBidi" w:hAnsiTheme="majorBidi" w:cstheme="majorBidi"/>
                                 <w:sz w:val="2"/>
@@ -15299,6 +15717,7 @@
                           </w:p>
                           <w:p>
                             <w:pPr>
+                              <w:spacing w:after="60"/>
                               <w:rPr>
                                 <w:rFonts w:asciiTheme="majorBidi" w:hAnsiTheme="majorBidi" w:cstheme="majorBidi"/>
                                 <w:b/>
@@ -15384,7 +15803,7 @@
           </mc:Choice>
           <mc:Fallback>
             <w:pict>
-              <v:rect w14:anchorId="2DD4B9FD" id="_x0000_s1035" style="position:absolute;left:0;text-align:left;margin-left:487pt;margin-top:.6pt;width:538.2pt;height:588pt;z-index:251681792;visibility:visible;mso-wrap-style:square;mso-width-percent:0;mso-height-percent:0;mso-wrap-distance-left:9pt;mso-wrap-distance-top:0;mso-wrap-distance-right:9pt;mso-wrap-distance-bottom:0;mso-position-horizontal:right;mso-position-horizontal-relative:margin;mso-position-vertical:absolute;mso-position-vertical-relative:text;mso-width-percent:0;mso-height-percent:0;mso-width-relative:margin;mso-height-relative:margin;v-text-anchor:middle" o:gfxdata="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" fillcolor="#555 [2160]" strokecolor="black [3200]" strokeweight=".5pt">
+              <v:rect w14:anchorId="2DD4B9FD" id="_x0000_s1036" style="position:absolute;left:0;text-align:left;margin-left:487pt;margin-top:-.1pt;width:538.2pt;height:452.4pt;z-index:251681792;visibility:visible;mso-wrap-style:square;mso-width-percent:0;mso-height-percent:0;mso-wrap-distance-left:9pt;mso-wrap-distance-top:0;mso-wrap-distance-right:9pt;mso-wrap-distance-bottom:0;mso-position-horizontal:right;mso-position-horizontal-relative:margin;mso-position-vertical:absolute;mso-position-vertical-relative:text;mso-width-percent:0;mso-height-percent:0;mso-width-relative:margin;mso-height-relative:margin;v-text-anchor:middle" o:gfxdata="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" fillcolor="#555 [2160]" strokecolor="black [3200]" strokeweight=".5pt">
                 <v:fill color2="#313131 [2608]" rotate="t" colors="0 #9b9b9b;.5 #8e8e8e;1 #797979" focus="100%" type="gradient">
                   <o:fill v:ext="view" type="gradientUnscaled"/>
                 </v:fill>
@@ -15395,7 +15814,7 @@
                         <w:pStyle w:val="ListParagraph"/>
                         <w:numPr>
                           <w:ilvl w:val="0"/>
-                          <w:numId w:val="76"/>
+                          <w:numId w:val="77"/>
                         </w:numPr>
                         <w:ind w:left="360"/>
                         <w:jc w:val="both"/>
@@ -15408,76 +15827,38 @@
                       <w:r>
                         <w:rPr>
                           <w:rFonts w:asciiTheme="majorBidi" w:hAnsiTheme="majorBidi" w:cstheme="majorBidi"/>
-                          <w:sz w:val="28"/>
-                          <w:szCs w:val="28"/>
-                        </w:rPr>
-                        <w:t>Safe testing → The Green environment runs side‑by‑side - can be validated before serving users.</w:t>
-                      </w:r>
-                    </w:p>
-                    <w:p>
-                      <w:pPr>
-                        <w:pStyle w:val="ListParagraph"/>
-                        <w:numPr>
-                          <w:ilvl w:val="0"/>
-                          <w:numId w:val="76"/>
-                        </w:numPr>
-                        <w:spacing w:after="120"/>
-                        <w:ind w:left="360"/>
-                        <w:jc w:val="both"/>
-                        <w:rPr>
-                          <w:rFonts w:asciiTheme="majorBidi" w:hAnsiTheme="majorBidi" w:cstheme="majorBidi"/>
-                          <w:sz w:val="28"/>
-                          <w:szCs w:val="28"/>
-                        </w:rPr>
-                      </w:pPr>
-                      <w:r>
-                        <w:rPr>
-                          <w:rFonts w:asciiTheme="majorBidi" w:hAnsiTheme="majorBidi" w:cstheme="majorBidi"/>
-                          <w:sz w:val="28"/>
-                          <w:szCs w:val="28"/>
-                        </w:rPr>
-                        <w:t xml:space="preserve">Predictable </w:t>
-                      </w:r>
-                      <w:proofErr w:type="spellStart"/>
-                      <w:r>
-                        <w:rPr>
-                          <w:rFonts w:asciiTheme="majorBidi" w:hAnsiTheme="majorBidi" w:cstheme="majorBidi"/>
-                          <w:sz w:val="28"/>
-                          <w:szCs w:val="28"/>
-                        </w:rPr>
-                        <w:t>behaviour</w:t>
-                      </w:r>
-                      <w:proofErr w:type="spellEnd"/>
-                      <w:r>
-                        <w:rPr>
-                          <w:rFonts w:asciiTheme="majorBidi" w:hAnsiTheme="majorBidi" w:cstheme="majorBidi"/>
-                          <w:sz w:val="28"/>
-                          <w:szCs w:val="28"/>
-                        </w:rPr>
-                        <w:t xml:space="preserve"> → Both environments are identical except for the version being tested.</w:t>
-                      </w:r>
-                    </w:p>
-                    <w:p>
-                      <w:pPr>
-                        <w:spacing w:after="60"/>
-                        <w:jc w:val="both"/>
-                        <w:rPr>
-                          <w:rFonts w:asciiTheme="majorBidi" w:hAnsiTheme="majorBidi" w:cstheme="majorBidi"/>
                           <w:b/>
                           <w:bCs/>
                           <w:sz w:val="28"/>
                           <w:szCs w:val="28"/>
                         </w:rPr>
-                      </w:pPr>
-                      <w:r>
-                        <w:rPr>
-                          <w:rFonts w:asciiTheme="majorBidi" w:hAnsiTheme="majorBidi" w:cstheme="majorBidi"/>
-                          <w:b/>
-                          <w:bCs/>
-                          <w:sz w:val="28"/>
-                          <w:szCs w:val="28"/>
-                        </w:rPr>
-                        <w:t>Disadvantages &amp; Considerations</w:t>
+                        <w:t>Stateful complications</w:t>
+                      </w:r>
+                      <w:r>
+                        <w:rPr>
+                          <w:rFonts w:asciiTheme="majorBidi" w:hAnsiTheme="majorBidi" w:cstheme="majorBidi"/>
+                          <w:sz w:val="28"/>
+                          <w:szCs w:val="28"/>
+                        </w:rPr>
+                        <w:t xml:space="preserve"> → For databases and </w:t>
+                      </w:r>
+                      <w:proofErr w:type="spellStart"/>
+                      <w:r>
+                        <w:rPr>
+                          <w:rFonts w:asciiTheme="majorBidi" w:hAnsiTheme="majorBidi" w:cstheme="majorBidi"/>
+                          <w:sz w:val="28"/>
+                          <w:szCs w:val="28"/>
+                        </w:rPr>
+                        <w:t>StatefulSets</w:t>
+                      </w:r>
+                      <w:proofErr w:type="spellEnd"/>
+                      <w:r>
+                        <w:rPr>
+                          <w:rFonts w:asciiTheme="majorBidi" w:hAnsiTheme="majorBidi" w:cstheme="majorBidi"/>
+                          <w:sz w:val="28"/>
+                          <w:szCs w:val="28"/>
+                        </w:rPr>
+                        <w:t>, data consistency between Blue and Green needs to be managed carefully.</w:t>
                       </w:r>
                     </w:p>
                     <w:p>
@@ -15487,6 +15868,7 @@
                           <w:ilvl w:val="0"/>
                           <w:numId w:val="77"/>
                         </w:numPr>
+                        <w:spacing w:after="120"/>
                         <w:ind w:left="360"/>
                         <w:jc w:val="both"/>
                         <w:rPr>
@@ -15498,76 +15880,20 @@
                       <w:r>
                         <w:rPr>
                           <w:rFonts w:asciiTheme="majorBidi" w:hAnsiTheme="majorBidi" w:cstheme="majorBidi"/>
-                          <w:sz w:val="28"/>
-                          <w:szCs w:val="28"/>
-                        </w:rPr>
-                        <w:t>Higher resource usage → Requires two full environments (double Pods, volumes, etc.).</w:t>
-                      </w:r>
-                    </w:p>
-                    <w:p>
-                      <w:pPr>
-                        <w:pStyle w:val="ListParagraph"/>
-                        <w:numPr>
-                          <w:ilvl w:val="0"/>
-                          <w:numId w:val="77"/>
-                        </w:numPr>
-                        <w:ind w:left="360"/>
-                        <w:jc w:val="both"/>
-                        <w:rPr>
-                          <w:rFonts w:asciiTheme="majorBidi" w:hAnsiTheme="majorBidi" w:cstheme="majorBidi"/>
-                          <w:sz w:val="28"/>
-                          <w:szCs w:val="28"/>
-                        </w:rPr>
-                      </w:pPr>
-                      <w:r>
-                        <w:rPr>
-                          <w:rFonts w:asciiTheme="majorBidi" w:hAnsiTheme="majorBidi" w:cstheme="majorBidi"/>
-                          <w:sz w:val="28"/>
-                          <w:szCs w:val="28"/>
-                        </w:rPr>
-                        <w:t xml:space="preserve">Stateful complications → For databases and </w:t>
-                      </w:r>
-                      <w:proofErr w:type="spellStart"/>
-                      <w:r>
-                        <w:rPr>
-                          <w:rFonts w:asciiTheme="majorBidi" w:hAnsiTheme="majorBidi" w:cstheme="majorBidi"/>
-                          <w:sz w:val="28"/>
-                          <w:szCs w:val="28"/>
-                        </w:rPr>
-                        <w:t>StatefulSets</w:t>
-                      </w:r>
-                      <w:proofErr w:type="spellEnd"/>
-                      <w:r>
-                        <w:rPr>
-                          <w:rFonts w:asciiTheme="majorBidi" w:hAnsiTheme="majorBidi" w:cstheme="majorBidi"/>
-                          <w:sz w:val="28"/>
-                          <w:szCs w:val="28"/>
-                        </w:rPr>
-                        <w:t>, data consistency between Blue and Green needs to be managed carefully.</w:t>
-                      </w:r>
-                    </w:p>
-                    <w:p>
-                      <w:pPr>
-                        <w:pStyle w:val="ListParagraph"/>
-                        <w:numPr>
-                          <w:ilvl w:val="0"/>
-                          <w:numId w:val="77"/>
-                        </w:numPr>
-                        <w:ind w:left="360"/>
-                        <w:jc w:val="both"/>
-                        <w:rPr>
-                          <w:rFonts w:asciiTheme="majorBidi" w:hAnsiTheme="majorBidi" w:cstheme="majorBidi"/>
-                          <w:sz w:val="28"/>
-                          <w:szCs w:val="28"/>
-                        </w:rPr>
-                      </w:pPr>
-                      <w:r>
-                        <w:rPr>
-                          <w:rFonts w:asciiTheme="majorBidi" w:hAnsiTheme="majorBidi" w:cstheme="majorBidi"/>
-                          <w:sz w:val="28"/>
-                          <w:szCs w:val="28"/>
-                        </w:rPr>
-                        <w:t>Network caching or connection drain → Long‑lived connections may require extra care to drain old traffic gracefully.</w:t>
+                          <w:b/>
+                          <w:bCs/>
+                          <w:sz w:val="28"/>
+                          <w:szCs w:val="28"/>
+                        </w:rPr>
+                        <w:t>Network caching or connection drain</w:t>
+                      </w:r>
+                      <w:r>
+                        <w:rPr>
+                          <w:rFonts w:asciiTheme="majorBidi" w:hAnsiTheme="majorBidi" w:cstheme="majorBidi"/>
+                          <w:sz w:val="28"/>
+                          <w:szCs w:val="28"/>
+                        </w:rPr>
+                        <w:t xml:space="preserve"> → Long‑lived connections may require extra care to drain old traffic gracefully.</w:t>
                       </w:r>
                     </w:p>
                     <w:p>
@@ -16266,6 +16592,7 @@
                     </w:tbl>
                     <w:p>
                       <w:pPr>
+                        <w:spacing w:after="120"/>
                         <w:rPr>
                           <w:rFonts w:asciiTheme="majorBidi" w:hAnsiTheme="majorBidi" w:cstheme="majorBidi"/>
                           <w:sz w:val="2"/>
@@ -16275,6 +16602,7 @@
                     </w:p>
                     <w:p>
                       <w:pPr>
+                        <w:spacing w:after="60"/>
                         <w:rPr>
                           <w:rFonts w:asciiTheme="majorBidi" w:hAnsiTheme="majorBidi" w:cstheme="majorBidi"/>
                           <w:b/>
@@ -17688,7 +18016,7 @@
           </mc:Choice>
           <mc:Fallback>
             <w:pict>
-              <v:rect w14:anchorId="799CAF81" id="Rectangle 13" o:spid="_x0000_s1036" style="position:absolute;margin-left:-.55pt;margin-top:39.15pt;width:352.35pt;height:82.35pt;z-index:251667456;visibility:visible;mso-wrap-style:square;mso-width-percent:0;mso-height-percent:0;mso-wrap-distance-left:9pt;mso-wrap-distance-top:0;mso-wrap-distance-right:9pt;mso-wrap-distance-bottom:0;mso-position-horizontal:absolute;mso-position-horizontal-relative:text;mso-position-vertical:absolute;mso-position-vertical-relative:text;mso-width-percent:0;mso-height-percent:0;mso-width-relative:margin;mso-height-relative:margin;v-text-anchor:middle" o:gfxdata="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" fillcolor="black [3200]" strokecolor="black [480]" strokeweight="1pt">
+              <v:rect w14:anchorId="799CAF81" id="Rectangle 13" o:spid="_x0000_s1037" style="position:absolute;margin-left:-.55pt;margin-top:39.15pt;width:352.35pt;height:82.35pt;z-index:251667456;visibility:visible;mso-wrap-style:square;mso-width-percent:0;mso-height-percent:0;mso-wrap-distance-left:9pt;mso-wrap-distance-top:0;mso-wrap-distance-right:9pt;mso-wrap-distance-bottom:0;mso-position-horizontal:absolute;mso-position-horizontal-relative:text;mso-position-vertical:absolute;mso-position-vertical-relative:text;mso-width-percent:0;mso-height-percent:0;mso-width-relative:margin;mso-height-relative:margin;v-text-anchor:middle" o:gfxdata="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" fillcolor="black [3200]" strokecolor="black [480]" strokeweight="1pt">
                 <v:textbox>
                   <w:txbxContent>
                     <w:p>
@@ -18868,7 +19196,7 @@
           </mc:Choice>
           <mc:Fallback>
             <w:pict>
-              <v:rect w14:anchorId="7C70E83F" id="Rectangle 12" o:spid="_x0000_s1037" style="position:absolute;left:0;text-align:left;margin-left:-1.1pt;margin-top:22.2pt;width:205.65pt;height:43.65pt;z-index:251666432;visibility:visible;mso-wrap-style:square;mso-height-percent:0;mso-wrap-distance-left:9pt;mso-wrap-distance-top:0;mso-wrap-distance-right:9pt;mso-wrap-distance-bottom:0;mso-position-horizontal:absolute;mso-position-horizontal-relative:text;mso-position-vertical:absolute;mso-position-vertical-relative:text;mso-height-percent:0;mso-height-relative:margin;v-text-anchor:middle" o:gfxdata="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" fillcolor="black [3200]" strokecolor="black [480]" strokeweight="1pt">
+              <v:rect w14:anchorId="7C70E83F" id="Rectangle 12" o:spid="_x0000_s1038" style="position:absolute;left:0;text-align:left;margin-left:-1.1pt;margin-top:22.2pt;width:205.65pt;height:43.65pt;z-index:251666432;visibility:visible;mso-wrap-style:square;mso-height-percent:0;mso-wrap-distance-left:9pt;mso-wrap-distance-top:0;mso-wrap-distance-right:9pt;mso-wrap-distance-bottom:0;mso-position-horizontal:absolute;mso-position-horizontal-relative:text;mso-position-vertical:absolute;mso-position-vertical-relative:text;mso-height-percent:0;mso-height-relative:margin;v-text-anchor:middle" o:gfxdata="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" fillcolor="black [3200]" strokecolor="black [480]" strokeweight="1pt">
                 <v:textbox>
                   <w:txbxContent>
                     <w:p>
@@ -23589,7 +23917,7 @@
           </mc:Choice>
           <mc:Fallback>
             <w:pict>
-              <v:rect w14:anchorId="6F83D22C" id="Rectangle 14" o:spid="_x0000_s1038" style="position:absolute;left:0;text-align:left;margin-left:0;margin-top:26.5pt;width:279.25pt;height:138pt;z-index:251671552;visibility:visible;mso-wrap-style:square;mso-width-percent:0;mso-height-percent:0;mso-wrap-distance-left:9pt;mso-wrap-distance-top:0;mso-wrap-distance-right:9pt;mso-wrap-distance-bottom:0;mso-position-horizontal:left;mso-position-horizontal-relative:margin;mso-position-vertical:absolute;mso-position-vertical-relative:text;mso-width-percent:0;mso-height-percent:0;mso-width-relative:margin;mso-height-relative:margin;v-text-anchor:middle" o:gfxdata="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" fillcolor="black [3200]" strokecolor="black [480]" strokeweight="1pt">
+              <v:rect w14:anchorId="6F83D22C" id="Rectangle 14" o:spid="_x0000_s1039" style="position:absolute;left:0;text-align:left;margin-left:0;margin-top:26.5pt;width:279.25pt;height:138pt;z-index:251671552;visibility:visible;mso-wrap-style:square;mso-width-percent:0;mso-height-percent:0;mso-wrap-distance-left:9pt;mso-wrap-distance-top:0;mso-wrap-distance-right:9pt;mso-wrap-distance-bottom:0;mso-position-horizontal:left;mso-position-horizontal-relative:margin;mso-position-vertical:absolute;mso-position-vertical-relative:text;mso-width-percent:0;mso-height-percent:0;mso-width-relative:margin;mso-height-relative:margin;v-text-anchor:middle" o:gfxdata="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" fillcolor="black [3200]" strokecolor="black [480]" strokeweight="1pt">
                 <v:textbox>
                   <w:txbxContent>
                     <w:p>
@@ -24789,7 +25117,7 @@
           </mc:Choice>
           <mc:Fallback>
             <w:pict>
-              <v:rect w14:anchorId="643E6BF2" id="_x0000_s1039" style="position:absolute;left:0;text-align:left;margin-left:0;margin-top:.6pt;width:279.25pt;height:324pt;z-index:251668480;visibility:visible;mso-wrap-style:square;mso-width-percent:0;mso-height-percent:0;mso-wrap-distance-left:9pt;mso-wrap-distance-top:0;mso-wrap-distance-right:9pt;mso-wrap-distance-bottom:0;mso-position-horizontal:left;mso-position-horizontal-relative:margin;mso-position-vertical:absolute;mso-position-vertical-relative:text;mso-width-percent:0;mso-height-percent:0;mso-width-relative:margin;mso-height-relative:margin;v-text-anchor:middle" o:gfxdata="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" fillcolor="black [3200]" strokecolor="black [480]" strokeweight="1pt">
+              <v:rect w14:anchorId="643E6BF2" id="_x0000_s1040" style="position:absolute;left:0;text-align:left;margin-left:0;margin-top:.6pt;width:279.25pt;height:324pt;z-index:251668480;visibility:visible;mso-wrap-style:square;mso-width-percent:0;mso-height-percent:0;mso-wrap-distance-left:9pt;mso-wrap-distance-top:0;mso-wrap-distance-right:9pt;mso-wrap-distance-bottom:0;mso-position-horizontal:left;mso-position-horizontal-relative:margin;mso-position-vertical:absolute;mso-position-vertical-relative:text;mso-width-percent:0;mso-height-percent:0;mso-width-relative:margin;mso-height-relative:margin;v-text-anchor:middle" o:gfxdata="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" fillcolor="black [3200]" strokecolor="black [480]" strokeweight="1pt">
                 <v:textbox>
                   <w:txbxContent>
                     <w:p>
@@ -26698,7 +27026,7 @@
           </mc:Choice>
           <mc:Fallback>
             <w:pict>
-              <v:rect w14:anchorId="6610E11E" id="Rectangle 15" o:spid="_x0000_s1040" style="position:absolute;left:0;text-align:left;margin-left:18pt;margin-top:19.6pt;width:162.55pt;height:84.55pt;z-index:251669504;visibility:visible;mso-wrap-style:square;mso-width-percent:0;mso-height-percent:0;mso-wrap-distance-left:9pt;mso-wrap-distance-top:0;mso-wrap-distance-right:9pt;mso-wrap-distance-bottom:0;mso-position-horizontal:absolute;mso-position-horizontal-relative:text;mso-position-vertical:absolute;mso-position-vertical-relative:text;mso-width-percent:0;mso-height-percent:0;mso-width-relative:margin;mso-height-relative:margin;v-text-anchor:middle" o:gfxdata="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" fillcolor="black [3200]" strokecolor="black [480]" strokeweight="1pt">
+              <v:rect w14:anchorId="6610E11E" id="Rectangle 15" o:spid="_x0000_s1041" style="position:absolute;left:0;text-align:left;margin-left:18pt;margin-top:19.6pt;width:162.55pt;height:84.55pt;z-index:251669504;visibility:visible;mso-wrap-style:square;mso-width-percent:0;mso-height-percent:0;mso-wrap-distance-left:9pt;mso-wrap-distance-top:0;mso-wrap-distance-right:9pt;mso-wrap-distance-bottom:0;mso-position-horizontal:absolute;mso-position-horizontal-relative:text;mso-position-vertical:absolute;mso-position-vertical-relative:text;mso-width-percent:0;mso-height-percent:0;mso-width-relative:margin;mso-height-relative:margin;v-text-anchor:middle" o:gfxdata="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" fillcolor="black [3200]" strokecolor="black [480]" strokeweight="1pt">
                 <v:textbox>
                   <w:txbxContent>
                     <w:p>
@@ -27828,7 +28156,7 @@
           </mc:Choice>
           <mc:Fallback>
             <w:pict>
-              <v:rect w14:anchorId="74A9D9DA" id="Rectangle 18" o:spid="_x0000_s1041" style="position:absolute;left:0;text-align:left;margin-left:18pt;margin-top:22.3pt;width:169.65pt;height:80.75pt;z-index:251676672;visibility:visible;mso-wrap-style:square;mso-height-percent:0;mso-wrap-distance-left:9pt;mso-wrap-distance-top:0;mso-wrap-distance-right:9pt;mso-wrap-distance-bottom:0;mso-position-horizontal:absolute;mso-position-horizontal-relative:text;mso-position-vertical:absolute;mso-position-vertical-relative:text;mso-height-percent:0;mso-height-relative:margin;v-text-anchor:middle" o:gfxdata="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" fillcolor="black [3200]" strokecolor="black [480]" strokeweight="1pt">
+              <v:rect w14:anchorId="74A9D9DA" id="Rectangle 18" o:spid="_x0000_s1042" style="position:absolute;left:0;text-align:left;margin-left:18pt;margin-top:22.3pt;width:169.65pt;height:80.75pt;z-index:251676672;visibility:visible;mso-wrap-style:square;mso-height-percent:0;mso-wrap-distance-left:9pt;mso-wrap-distance-top:0;mso-wrap-distance-right:9pt;mso-wrap-distance-bottom:0;mso-position-horizontal:absolute;mso-position-horizontal-relative:text;mso-position-vertical:absolute;mso-position-vertical-relative:text;mso-height-percent:0;mso-height-relative:margin;v-text-anchor:middle" o:gfxdata="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" fillcolor="black [3200]" strokecolor="black [480]" strokeweight="1pt">
                 <v:textbox>
                   <w:txbxContent>
                     <w:p>
@@ -29334,7 +29662,7 @@
           </mc:Choice>
           <mc:Fallback>
             <w:pict>
-              <v:rect w14:anchorId="4897CED0" id="Rectangle 19" o:spid="_x0000_s1042" style="position:absolute;left:0;text-align:left;margin-left:0;margin-top:24.65pt;width:219.8pt;height:134.75pt;z-index:251677696;visibility:visible;mso-wrap-style:square;mso-width-percent:0;mso-height-percent:0;mso-wrap-distance-left:9pt;mso-wrap-distance-top:0;mso-wrap-distance-right:9pt;mso-wrap-distance-bottom:0;mso-position-horizontal:left;mso-position-horizontal-relative:margin;mso-position-vertical:absolute;mso-position-vertical-relative:text;mso-width-percent:0;mso-height-percent:0;mso-width-relative:margin;mso-height-relative:margin;v-text-anchor:middle" o:gfxdata="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" fillcolor="black [3200]" strokecolor="black [480]" strokeweight="1pt">
+              <v:rect w14:anchorId="4897CED0" id="Rectangle 19" o:spid="_x0000_s1043" style="position:absolute;left:0;text-align:left;margin-left:0;margin-top:24.65pt;width:219.8pt;height:134.75pt;z-index:251677696;visibility:visible;mso-wrap-style:square;mso-width-percent:0;mso-height-percent:0;mso-wrap-distance-left:9pt;mso-wrap-distance-top:0;mso-wrap-distance-right:9pt;mso-wrap-distance-bottom:0;mso-position-horizontal:left;mso-position-horizontal-relative:margin;mso-position-vertical:absolute;mso-position-vertical-relative:text;mso-width-percent:0;mso-height-percent:0;mso-width-relative:margin;mso-height-relative:margin;v-text-anchor:middle" o:gfxdata="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" fillcolor="black [3200]" strokecolor="black [480]" strokeweight="1pt">
                 <v:textbox>
                   <w:txbxContent>
                     <w:p>
@@ -30473,7 +30801,7 @@
           </mc:Choice>
           <mc:Fallback>
             <w:pict>
-              <v:rect w14:anchorId="6AA14DDD" id="Rectangle 20" o:spid="_x0000_s1043" style="position:absolute;left:0;text-align:left;margin-left:0;margin-top:-.1pt;width:262.9pt;height:321.8pt;z-index:251678720;visibility:visible;mso-wrap-style:square;mso-width-percent:0;mso-height-percent:0;mso-wrap-distance-left:9pt;mso-wrap-distance-top:0;mso-wrap-distance-right:9pt;mso-wrap-distance-bottom:0;mso-position-horizontal:left;mso-position-horizontal-relative:margin;mso-position-vertical:absolute;mso-position-vertical-relative:text;mso-width-percent:0;mso-height-percent:0;mso-width-relative:margin;mso-height-relative:margin;v-text-anchor:middle" o:gfxdata="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" fillcolor="black [3200]" strokecolor="black [480]" strokeweight="1pt">
+              <v:rect w14:anchorId="6AA14DDD" id="Rectangle 20" o:spid="_x0000_s1044" style="position:absolute;left:0;text-align:left;margin-left:0;margin-top:-.1pt;width:262.9pt;height:321.8pt;z-index:251678720;visibility:visible;mso-wrap-style:square;mso-width-percent:0;mso-height-percent:0;mso-wrap-distance-left:9pt;mso-wrap-distance-top:0;mso-wrap-distance-right:9pt;mso-wrap-distance-bottom:0;mso-position-horizontal:left;mso-position-horizontal-relative:margin;mso-position-vertical:absolute;mso-position-vertical-relative:text;mso-width-percent:0;mso-height-percent:0;mso-width-relative:margin;mso-height-relative:margin;v-text-anchor:middle" o:gfxdata="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" fillcolor="black [3200]" strokecolor="black [480]" strokeweight="1pt">
                 <v:textbox>
                   <w:txbxContent>
                     <w:p>
@@ -33644,7 +33972,7 @@
           </mc:Choice>
           <mc:Fallback>
             <w:pict>
-              <v:rect w14:anchorId="52503CAD" id="_x0000_s1044" style="position:absolute;left:0;text-align:left;margin-left:16.9pt;margin-top:21.85pt;width:202.9pt;height:118.35pt;z-index:251672576;visibility:visible;mso-wrap-style:square;mso-width-percent:0;mso-height-percent:0;mso-wrap-distance-left:9pt;mso-wrap-distance-top:0;mso-wrap-distance-right:9pt;mso-wrap-distance-bottom:0;mso-position-horizontal:absolute;mso-position-horizontal-relative:text;mso-position-vertical:absolute;mso-position-vertical-relative:text;mso-width-percent:0;mso-height-percent:0;mso-width-relative:margin;mso-height-relative:margin;v-text-anchor:middle" o:gfxdata="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" fillcolor="black [3200]" strokecolor="black [480]" strokeweight="1pt">
+              <v:rect w14:anchorId="52503CAD" id="_x0000_s1045" style="position:absolute;left:0;text-align:left;margin-left:16.9pt;margin-top:21.85pt;width:202.9pt;height:118.35pt;z-index:251672576;visibility:visible;mso-wrap-style:square;mso-width-percent:0;mso-height-percent:0;mso-wrap-distance-left:9pt;mso-wrap-distance-top:0;mso-wrap-distance-right:9pt;mso-wrap-distance-bottom:0;mso-position-horizontal:absolute;mso-position-horizontal-relative:text;mso-position-vertical:absolute;mso-position-vertical-relative:text;mso-width-percent:0;mso-height-percent:0;mso-width-relative:margin;mso-height-relative:margin;v-text-anchor:middle" o:gfxdata="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" fillcolor="black [3200]" strokecolor="black [480]" strokeweight="1pt">
                 <v:textbox>
                   <w:txbxContent>
                     <w:p>
@@ -34496,7 +34824,7 @@
           </mc:Choice>
           <mc:Fallback>
             <w:pict>
-              <v:rect w14:anchorId="0430BD16" id="_x0000_s1045" style="position:absolute;left:0;text-align:left;margin-left:18pt;margin-top:5pt;width:224.75pt;height:105.25pt;z-index:251673600;visibility:visible;mso-wrap-style:square;mso-height-percent:0;mso-wrap-distance-left:9pt;mso-wrap-distance-top:0;mso-wrap-distance-right:9pt;mso-wrap-distance-bottom:0;mso-position-horizontal:absolute;mso-position-horizontal-relative:text;mso-position-vertical:absolute;mso-position-vertical-relative:text;mso-height-percent:0;mso-height-relative:margin;v-text-anchor:middle" o:gfxdata="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" fillcolor="black [3200]" strokecolor="black [480]" strokeweight="1pt">
+              <v:rect w14:anchorId="0430BD16" id="_x0000_s1046" style="position:absolute;left:0;text-align:left;margin-left:18pt;margin-top:5pt;width:224.75pt;height:105.25pt;z-index:251673600;visibility:visible;mso-wrap-style:square;mso-height-percent:0;mso-wrap-distance-left:9pt;mso-wrap-distance-top:0;mso-wrap-distance-right:9pt;mso-wrap-distance-bottom:0;mso-position-horizontal:absolute;mso-position-horizontal-relative:text;mso-position-vertical:absolute;mso-position-vertical-relative:text;mso-height-percent:0;mso-height-relative:margin;v-text-anchor:middle" o:gfxdata="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" fillcolor="black [3200]" strokecolor="black [480]" strokeweight="1pt">
                 <v:textbox>
                   <w:txbxContent>
                     <w:p>
@@ -35281,7 +35609,7 @@
           </mc:Choice>
           <mc:Fallback>
             <w:pict>
-              <v:rect w14:anchorId="204C0CBA" id="_x0000_s1046" style="position:absolute;left:0;text-align:left;margin-left:17.45pt;margin-top:23.1pt;width:162.55pt;height:119.45pt;z-index:251674624;visibility:visible;mso-wrap-style:square;mso-width-percent:0;mso-height-percent:0;mso-wrap-distance-left:9pt;mso-wrap-distance-top:0;mso-wrap-distance-right:9pt;mso-wrap-distance-bottom:0;mso-position-horizontal:absolute;mso-position-horizontal-relative:text;mso-position-vertical:absolute;mso-position-vertical-relative:text;mso-width-percent:0;mso-height-percent:0;mso-width-relative:margin;mso-height-relative:margin;v-text-anchor:middle" o:gfxdata="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" fillcolor="black [3200]" strokecolor="black [480]" strokeweight="1pt">
+              <v:rect w14:anchorId="204C0CBA" id="_x0000_s1047" style="position:absolute;left:0;text-align:left;margin-left:17.45pt;margin-top:23.1pt;width:162.55pt;height:119.45pt;z-index:251674624;visibility:visible;mso-wrap-style:square;mso-width-percent:0;mso-height-percent:0;mso-wrap-distance-left:9pt;mso-wrap-distance-top:0;mso-wrap-distance-right:9pt;mso-wrap-distance-bottom:0;mso-position-horizontal:absolute;mso-position-horizontal-relative:text;mso-position-vertical:absolute;mso-position-vertical-relative:text;mso-width-percent:0;mso-height-percent:0;mso-width-relative:margin;mso-height-relative:margin;v-text-anchor:middle" o:gfxdata="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" fillcolor="black [3200]" strokecolor="black [480]" strokeweight="1pt">
                 <v:textbox>
                   <w:txbxContent>
                     <w:p>
@@ -36367,7 +36695,7 @@
           </mc:Choice>
           <mc:Fallback>
             <w:pict>
-              <v:rect w14:anchorId="115FEEF4" id="Rectangle 17" o:spid="_x0000_s1047" style="position:absolute;left:0;text-align:left;margin-left:1.1pt;margin-top:21.4pt;width:146.2pt;height:99.25pt;z-index:251675648;visibility:visible;mso-wrap-style:square;mso-width-percent:0;mso-height-percent:0;mso-wrap-distance-left:9pt;mso-wrap-distance-top:0;mso-wrap-distance-right:9pt;mso-wrap-distance-bottom:0;mso-position-horizontal:absolute;mso-position-horizontal-relative:text;mso-position-vertical:absolute;mso-position-vertical-relative:text;mso-width-percent:0;mso-height-percent:0;mso-width-relative:margin;mso-height-relative:margin;v-text-anchor:middle" o:gfxdata="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" fillcolor="black [3200]" strokecolor="black [480]" strokeweight="1pt">
+              <v:rect w14:anchorId="115FEEF4" id="Rectangle 17" o:spid="_x0000_s1048" style="position:absolute;left:0;text-align:left;margin-left:1.1pt;margin-top:21.4pt;width:146.2pt;height:99.25pt;z-index:251675648;visibility:visible;mso-wrap-style:square;mso-width-percent:0;mso-height-percent:0;mso-wrap-distance-left:9pt;mso-wrap-distance-top:0;mso-wrap-distance-right:9pt;mso-wrap-distance-bottom:0;mso-position-horizontal:absolute;mso-position-horizontal-relative:text;mso-position-vertical:absolute;mso-position-vertical-relative:text;mso-width-percent:0;mso-height-percent:0;mso-width-relative:margin;mso-height-relative:margin;v-text-anchor:middle" o:gfxdata="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" fillcolor="black [3200]" strokecolor="black [480]" strokeweight="1pt">
                 <v:textbox>
                   <w:txbxContent>
                     <w:p>
@@ -37347,7 +37675,7 @@
 </file>
 
 <file path=word/numbering.xml><?xml version="1.0" encoding="utf-8"?>
-<w:numbering xmlns:wpc="http://schemas.microsoft.com/office/word/2010/wordprocessingCanvas" xmlns:cx="http://schemas.microsoft.com/office/drawing/2014/chartex" xmlns:cx1="http://schemas.microsoft.com/office/drawing/2015/9/8/chartex" xmlns:cx2="http://schemas.microsoft.com/office/drawing/2015/10/21/chartex" xmlns:cx3="http://schemas.microsoft.com/office/drawing/2016/5/9/chartex" xmlns:cx4="http://schemas.microsoft.com/office/drawing/2016/5/10/chartex" xmlns:cx5="http://schemas.microsoft.com/office/drawing/2016/5/11/chartex" xmlns:cx6="http://schemas.microsoft.com/office/drawing/2016/5/12/chartex" xmlns:cx7="http://schemas.microsoft.com/office/drawing/2016/5/13/chartex" xmlns:cx8="http://schemas.microsoft.com/office/drawing/2016/5/14/chartex" xmlns:mc="http://schemas.openxmlformats.org/markup-compatibility/2006" xmlns:aink="http://schemas.microsoft.com/office/drawing/2016/ink" xmlns:am3d="http://schemas.microsoft.com/office/drawing/2017/model3d" xmlns:o="urn:schemas-microsoft-com:office:office" xmlns:oel="http://schemas.microsoft.com/office/2019/extlst" xmlns:r="http://schemas.openxmlformats.org/officeDocument/2006/relationships" xmlns:m="http://schemas.openxmlformats.org/officeDocument/2006/math" xmlns:v="urn:schemas-microsoft-com:vml" xmlns:wp14="http://schemas.microsoft.com/office/word/2010/wordprocessingDrawing" xmlns:wp="http://schemas.openxmlformats.org/drawingml/2006/wordprocessingDrawing" xmlns:w10="urn:schemas-microsoft-com:office:word" xmlns:w="http://schemas.openxmlformats.org/wordprocessingml/2006/main" xmlns:w14="http://schemas.microsoft.com/office/word/2010/wordml" xmlns:w15="http://schemas.microsoft.com/office/word/2012/wordml" xmlns:w16cex="http://schemas.microsoft.com/office/word/2018/wordml/cex" xmlns:w16cid="http://schemas.microsoft.com/office/word/2016/wordml/cid" xmlns:w16="http://schemas.microsoft.com/office/word/2018/wordml" xmlns:w16sdtdh="http://schemas.microsoft.com/office/word/2020/wordml/sdtdatahash" xmlns:w16se="http://schemas.microsoft.com/office/word/2015/wordml/symex" xmlns:wpg="http://schemas.microsoft.com/office/word/2010/wordprocessingGroup" xmlns:wpi="http://schemas.microsoft.com/office/word/2010/wordprocessingInk" xmlns:wne="http://schemas.microsoft.com/office/word/2006/wordml" xmlns:wps="http://schemas.microsoft.com/office/word/2010/wordprocessingShape" mc:Ignorable="w14 w15 w16se w16cid w16 w16cex w16sdtdh wp14">
+<w:numbering xmlns:wpc="http://schemas.microsoft.com/office/word/2010/wordprocessingCanvas" xmlns:cx="http://schemas.microsoft.com/office/drawing/2014/chartex" xmlns:cx1="http://schemas.microsoft.com/office/drawing/2015/9/8/chartex" xmlns:cx2="http://schemas.microsoft.com/office/drawing/2015/10/21/chartex" xmlns:cx3="http://schemas.microsoft.com/office/drawing/2016/5/9/chartex" xmlns:cx4="http://schemas.microsoft.com/office/drawing/2016/5/10/chartex" xmlns:cx5="http://schemas.microsoft.com/office/drawing/2016/5/11/chartex" xmlns:cx6="http://schemas.microsoft.com/office/drawing/2016/5/12/chartex" xmlns:cx7="http://schemas.microsoft.com/office/drawing/2016/5/13/chartex" xmlns:cx8="http://schemas.microsoft.com/office/drawing/2016/5/14/chartex" xmlns:mc="http://schemas.openxmlformats.org/markup-compatibility/2006" xmlns:aink="http://schemas.microsoft.com/office/drawing/2016/ink" xmlns:am3d="http://schemas.microsoft.com/office/drawing/2017/model3d" xmlns:o="urn:schemas-microsoft-com:office:office" xmlns:oel="http://schemas.microsoft.com/office/2019/extlst" xmlns:r="http://schemas.openxmlformats.org/officeDocument/2006/relationships" xmlns:m="http://schemas.openxmlformats.org/officeDocument/2006/math" xmlns:v="urn:schemas-microsoft-com:vml" xmlns:wp14="http://schemas.microsoft.com/office/word/2010/wordprocessingDrawing" xmlns:wp="http://schemas.openxmlformats.org/drawingml/2006/wordprocessingDrawing" xmlns:w10="urn:schemas-microsoft-com:office:word" xmlns:w="http://schemas.openxmlformats.org/wordprocessingml/2006/main" xmlns:w14="http://schemas.microsoft.com/office/word/2010/wordml" xmlns:w15="http://schemas.microsoft.com/office/word/2012/wordml" xmlns:w16cex="http://schemas.microsoft.com/office/word/2018/wordml/cex" xmlns:w16cid="http://schemas.microsoft.com/office/word/2016/wordml/cid" xmlns:w16="http://schemas.microsoft.com/office/word/2018/wordml" xmlns:w16du="http://schemas.microsoft.com/office/word/2023/wordml/word16du" xmlns:w16sdtdh="http://schemas.microsoft.com/office/word/2020/wordml/sdtdatahash" xmlns:w16sdtfl="http://schemas.microsoft.com/office/word/2024/wordml/sdtformatlock" xmlns:w16se="http://schemas.microsoft.com/office/word/2015/wordml/symex" xmlns:wpg="http://schemas.microsoft.com/office/word/2010/wordprocessingGroup" xmlns:wpi="http://schemas.microsoft.com/office/word/2010/wordprocessingInk" xmlns:wne="http://schemas.microsoft.com/office/word/2006/wordml" xmlns:wps="http://schemas.microsoft.com/office/word/2010/wordprocessingShape" mc:Ignorable="w14 w15 w16se w16cid w16 w16cex w16sdtdh w16sdtfl w16du wp14">
   <w:abstractNum w:abstractNumId="0" w15:restartNumberingAfterBreak="0">
     <w:nsid w:val="00B547E6"/>
     <w:multiLevelType w:val="hybridMultilevel"/>
@@ -46061,7 +46389,7 @@
 </file>
 
 <file path=word/styles.xml><?xml version="1.0" encoding="utf-8"?>
-<w:styles xmlns:mc="http://schemas.openxmlformats.org/markup-compatibility/2006" xmlns:r="http://schemas.openxmlformats.org/officeDocument/2006/relationships" xmlns:w="http://schemas.openxmlformats.org/wordprocessingml/2006/main" xmlns:w14="http://schemas.microsoft.com/office/word/2010/wordml" xmlns:w15="http://schemas.microsoft.com/office/word/2012/wordml" xmlns:w16cex="http://schemas.microsoft.com/office/word/2018/wordml/cex" xmlns:w16cid="http://schemas.microsoft.com/office/word/2016/wordml/cid" xmlns:w16="http://schemas.microsoft.com/office/word/2018/wordml" xmlns:w16sdtdh="http://schemas.microsoft.com/office/word/2020/wordml/sdtdatahash" xmlns:w16se="http://schemas.microsoft.com/office/word/2015/wordml/symex" mc:Ignorable="w14 w15 w16se w16cid w16 w16cex w16sdtdh">
+<w:styles xmlns:mc="http://schemas.openxmlformats.org/markup-compatibility/2006" xmlns:r="http://schemas.openxmlformats.org/officeDocument/2006/relationships" xmlns:w="http://schemas.openxmlformats.org/wordprocessingml/2006/main" xmlns:w14="http://schemas.microsoft.com/office/word/2010/wordml" xmlns:w15="http://schemas.microsoft.com/office/word/2012/wordml" xmlns:w16cex="http://schemas.microsoft.com/office/word/2018/wordml/cex" xmlns:w16cid="http://schemas.microsoft.com/office/word/2016/wordml/cid" xmlns:w16="http://schemas.microsoft.com/office/word/2018/wordml" xmlns:w16du="http://schemas.microsoft.com/office/word/2023/wordml/word16du" xmlns:w16sdtdh="http://schemas.microsoft.com/office/word/2020/wordml/sdtdatahash" xmlns:w16sdtfl="http://schemas.microsoft.com/office/word/2024/wordml/sdtformatlock" xmlns:w16se="http://schemas.microsoft.com/office/word/2015/wordml/symex" mc:Ignorable="w14 w15 w16se w16cid w16 w16cex w16sdtdh w16sdtfl w16du">
   <w:docDefaults>
     <w:rPrDefault>
       <w:rPr>

</xml_diff>